<commit_message>
Audio file save in Intake form.
</commit_message>
<xml_diff>
--- a/PainTrax.Web/wwwroot/ReportTemplate/IPMC/report-template-ie.docx
+++ b/PainTrax.Web/wwwroot/ReportTemplate/IPMC/report-template-ie.docx
@@ -96,7 +96,25 @@
           <w:sz w:val="24"/>
           <w:szCs w:val="24"/>
         </w:rPr>
-        <w:t>{{PatientName}}</w:t>
+        <w:t>{{</w:t>
+      </w:r>
+      <w:proofErr w:type="spellStart"/>
+      <w:r>
+        <w:rPr>
+          <w:rFonts w:ascii="Times New Roman" w:eastAsia="Calibri" w:hAnsi="Times New Roman" w:cs="Times New Roman"/>
+          <w:sz w:val="24"/>
+          <w:szCs w:val="24"/>
+        </w:rPr>
+        <w:t>PatientName</w:t>
+      </w:r>
+      <w:proofErr w:type="spellEnd"/>
+      <w:r>
+        <w:rPr>
+          <w:rFonts w:ascii="Times New Roman" w:eastAsia="Calibri" w:hAnsi="Times New Roman" w:cs="Times New Roman"/>
+          <w:sz w:val="24"/>
+          <w:szCs w:val="24"/>
+        </w:rPr>
+        <w:t>}}</w:t>
       </w:r>
     </w:p>
     <w:p>
@@ -379,6 +397,7 @@
         </w:rPr>
         <w:t>{{</w:t>
       </w:r>
+      <w:proofErr w:type="spellStart"/>
       <w:r>
         <w:rPr>
           <w:rFonts w:ascii="Times New Roman" w:eastAsia="Times New Roman" w:hAnsi="Times New Roman" w:cs="Times New Roman"/>
@@ -389,6 +408,7 @@
         </w:rPr>
         <w:t>DisabilitySummary</w:t>
       </w:r>
+      <w:proofErr w:type="spellEnd"/>
       <w:r>
         <w:rPr>
           <w:rFonts w:ascii="Times New Roman" w:eastAsia="Times New Roman" w:hAnsi="Times New Roman" w:cs="Times New Roman"/>
@@ -437,8 +457,9 @@
           <w:szCs w:val="24"/>
           <w:u w:val="single"/>
         </w:rPr>
-        <w:t>CHIEF COMPLAINTS:</w:t>
-      </w:r>
+        <w:t xml:space="preserve">CHIEF </w:t>
+      </w:r>
+      <w:proofErr w:type="gramStart"/>
       <w:r>
         <w:rPr>
           <w:rFonts w:ascii="Times New Roman" w:hAnsi="Times New Roman" w:cs="Times New Roman"/>
@@ -448,6 +469,17 @@
           <w:szCs w:val="24"/>
           <w:u w:val="single"/>
         </w:rPr>
+        <w:t>COMPLAINTS:</w:t>
+      </w:r>
+      <w:r>
+        <w:rPr>
+          <w:rFonts w:ascii="Times New Roman" w:hAnsi="Times New Roman" w:cs="Times New Roman"/>
+          <w:b/>
+          <w:bCs/>
+          <w:sz w:val="24"/>
+          <w:szCs w:val="24"/>
+          <w:u w:val="single"/>
+        </w:rPr>
         <w:t xml:space="preserve"> </w:t>
       </w:r>
       <w:r>
@@ -458,6 +490,7 @@
         </w:rPr>
         <w:t>{{</w:t>
       </w:r>
+      <w:proofErr w:type="gramEnd"/>
       <w:r>
         <w:rPr>
           <w:rFonts w:ascii="Times New Roman" w:hAnsi="Times New Roman" w:cs="Times New Roman"/>
@@ -634,170 +667,52 @@
           <w:sz w:val="24"/>
           <w:szCs w:val="24"/>
         </w:rPr>
-        <w:t xml:space="preserve"> The patient complains of pain</w:t>
-      </w:r>
-      <w:r>
-        <w:rPr>
-          <w:rFonts w:ascii="Times New Roman" w:hAnsi="Times New Roman" w:cs="Times New Roman"/>
-          <w:sz w:val="24"/>
-          <w:szCs w:val="24"/>
-        </w:rPr>
-        <w:t xml:space="preserve"> and</w:t>
-      </w:r>
-      <w:r>
-        <w:rPr>
-          <w:rFonts w:ascii="Times New Roman" w:hAnsi="Times New Roman" w:cs="Times New Roman"/>
-          <w:sz w:val="24"/>
-          <w:szCs w:val="24"/>
-        </w:rPr>
-        <w:t xml:space="preserve"> stiffness in the neck region. </w:t>
-      </w:r>
-      <w:r>
-        <w:rPr>
-          <w:rFonts w:ascii="Times New Roman" w:hAnsi="Times New Roman" w:cs="Times New Roman"/>
-          <w:sz w:val="24"/>
-          <w:szCs w:val="24"/>
-        </w:rPr>
-        <w:t>The pain radiates from the neck to ______ right</w:t>
-      </w:r>
-      <w:r>
-        <w:rPr>
-          <w:rFonts w:ascii="Times New Roman" w:hAnsi="Times New Roman" w:cs="Times New Roman"/>
-          <w:sz w:val="24"/>
-          <w:szCs w:val="24"/>
-        </w:rPr>
-        <w:t xml:space="preserve"> arm</w:t>
-      </w:r>
-      <w:r>
-        <w:rPr>
-          <w:rFonts w:ascii="Times New Roman" w:hAnsi="Times New Roman" w:cs="Times New Roman"/>
-          <w:sz w:val="24"/>
-          <w:szCs w:val="24"/>
-        </w:rPr>
-        <w:t xml:space="preserve"> / left arm, hand and fingers and associated with tingling, numbness, burning sensation</w:t>
-      </w:r>
-      <w:r>
-        <w:rPr>
-          <w:rFonts w:ascii="Times New Roman" w:hAnsi="Times New Roman" w:cs="Times New Roman"/>
-          <w:sz w:val="24"/>
-          <w:szCs w:val="24"/>
-        </w:rPr>
-        <w:t>,</w:t>
-      </w:r>
-      <w:r>
-        <w:rPr>
-          <w:rFonts w:ascii="Times New Roman" w:hAnsi="Times New Roman" w:cs="Times New Roman"/>
-          <w:sz w:val="24"/>
-          <w:szCs w:val="24"/>
-        </w:rPr>
-        <w:t xml:space="preserve"> and spasms. </w:t>
-      </w:r>
-      <w:r>
-        <w:rPr>
-          <w:rFonts w:ascii="Times New Roman" w:hAnsi="Times New Roman" w:cs="Times New Roman"/>
-          <w:sz w:val="24"/>
-          <w:szCs w:val="24"/>
-        </w:rPr>
-        <w:t>The patient has difficulty turning</w:t>
-      </w:r>
-      <w:r>
-        <w:rPr>
-          <w:rFonts w:ascii="Times New Roman" w:hAnsi="Times New Roman" w:cs="Times New Roman"/>
-          <w:sz w:val="24"/>
-          <w:szCs w:val="24"/>
-        </w:rPr>
-        <w:t>/</w:t>
-      </w:r>
-      <w:r>
-        <w:rPr>
-          <w:rFonts w:ascii="Times New Roman" w:hAnsi="Times New Roman" w:cs="Times New Roman"/>
-          <w:sz w:val="24"/>
-          <w:szCs w:val="24"/>
-        </w:rPr>
-        <w:t>rotating</w:t>
-      </w:r>
-      <w:r>
-        <w:rPr>
-          <w:rFonts w:ascii="Times New Roman" w:hAnsi="Times New Roman" w:cs="Times New Roman"/>
-          <w:sz w:val="24"/>
-          <w:szCs w:val="24"/>
-        </w:rPr>
-        <w:t xml:space="preserve"> the head</w:t>
-      </w:r>
-      <w:r>
-        <w:rPr>
-          <w:rFonts w:ascii="Times New Roman" w:hAnsi="Times New Roman" w:cs="Times New Roman"/>
-          <w:sz w:val="24"/>
-          <w:szCs w:val="24"/>
-        </w:rPr>
-        <w:t>,</w:t>
-      </w:r>
-      <w:r>
-        <w:rPr>
-          <w:rFonts w:ascii="Times New Roman" w:hAnsi="Times New Roman" w:cs="Times New Roman"/>
-          <w:sz w:val="24"/>
-          <w:szCs w:val="24"/>
-        </w:rPr>
-        <w:t xml:space="preserve"> and</w:t>
-      </w:r>
-      <w:r>
-        <w:rPr>
-          <w:rFonts w:ascii="Times New Roman" w:hAnsi="Times New Roman" w:cs="Times New Roman"/>
-          <w:sz w:val="24"/>
-          <w:szCs w:val="24"/>
-        </w:rPr>
-        <w:t xml:space="preserve"> gripping objects.  </w:t>
-      </w:r>
-      <w:r>
-        <w:rPr>
-          <w:rFonts w:ascii="Times New Roman" w:hAnsi="Times New Roman" w:cs="Times New Roman"/>
-          <w:sz w:val="24"/>
-          <w:szCs w:val="24"/>
-        </w:rPr>
-        <w:t>There is n</w:t>
-      </w:r>
-      <w:r>
-        <w:rPr>
-          <w:rFonts w:ascii="Times New Roman" w:hAnsi="Times New Roman" w:cs="Times New Roman"/>
-          <w:sz w:val="24"/>
-          <w:szCs w:val="24"/>
-        </w:rPr>
-        <w:t xml:space="preserve">o </w:t>
-      </w:r>
-      <w:r>
-        <w:rPr>
-          <w:rFonts w:ascii="Times New Roman" w:hAnsi="Times New Roman" w:cs="Times New Roman"/>
-          <w:sz w:val="24"/>
-          <w:szCs w:val="24"/>
-        </w:rPr>
-        <w:t xml:space="preserve">sustained </w:t>
-      </w:r>
-      <w:r>
-        <w:rPr>
-          <w:rFonts w:ascii="Times New Roman" w:hAnsi="Times New Roman" w:cs="Times New Roman"/>
-          <w:sz w:val="24"/>
-          <w:szCs w:val="24"/>
-        </w:rPr>
-        <w:t>improvement with physical therapy. Pain score is ___/10.</w:t>
-      </w:r>
-      <w:r>
-        <w:rPr>
-          <w:rFonts w:ascii="Times New Roman" w:hAnsi="Times New Roman" w:cs="Times New Roman"/>
-          <w:sz w:val="24"/>
-          <w:szCs w:val="24"/>
-        </w:rPr>
         <w:t xml:space="preserve"> </w:t>
       </w:r>
-    </w:p>
-    <w:p>
-      <w:pPr>
-        <w:spacing w:after="0" w:line="240" w:lineRule="auto"/>
-        <w:rPr>
-          <w:rFonts w:ascii="Times New Roman" w:hAnsi="Times New Roman" w:cs="Times New Roman"/>
-          <w:sz w:val="24"/>
-          <w:szCs w:val="24"/>
-        </w:rPr>
-      </w:pPr>
+      <w:r>
+        <w:rPr>
+          <w:rFonts w:ascii="Times New Roman" w:hAnsi="Times New Roman" w:cs="Times New Roman"/>
+          <w:sz w:val="24"/>
+          <w:szCs w:val="24"/>
+        </w:rPr>
+        <w:t>{{</w:t>
+      </w:r>
+      <w:proofErr w:type="spellStart"/>
+      <w:r>
+        <w:rPr>
+          <w:rFonts w:ascii="Times New Roman" w:hAnsi="Times New Roman" w:cs="Times New Roman"/>
+          <w:sz w:val="24"/>
+          <w:szCs w:val="24"/>
+        </w:rPr>
+        <w:t>NeckCC</w:t>
+      </w:r>
+      <w:proofErr w:type="spellEnd"/>
+      <w:r>
+        <w:rPr>
+          <w:rFonts w:ascii="Times New Roman" w:hAnsi="Times New Roman" w:cs="Times New Roman"/>
+          <w:sz w:val="24"/>
+          <w:szCs w:val="24"/>
+        </w:rPr>
+        <w:t>}}</w:t>
+      </w:r>
+    </w:p>
+    <w:p>
+      <w:pPr>
+        <w:spacing w:after="0" w:line="240" w:lineRule="auto"/>
+        <w:rPr>
+          <w:rFonts w:ascii="Times New Roman" w:hAnsi="Times New Roman" w:cs="Times New Roman"/>
+          <w:sz w:val="24"/>
+          <w:szCs w:val="24"/>
+        </w:rPr>
+      </w:pPr>
+      <w:r>
+        <w:rPr>
+          <w:rFonts w:ascii="Times New Roman" w:hAnsi="Times New Roman" w:cs="Times New Roman"/>
+          <w:sz w:val="24"/>
+          <w:szCs w:val="24"/>
+        </w:rPr>
+        <w:tab/>
+      </w:r>
     </w:p>
     <w:p>
       <w:pPr>
@@ -1027,7 +942,43 @@
           <w:sz w:val="24"/>
           <w:szCs w:val="24"/>
         </w:rPr>
-        <w:t>There is no previous history of trauma./There is a previous history of trauma./ The patient was asymptomatic / symptomatic prior to the accident.</w:t>
+        <w:t xml:space="preserve">There is no previous history of </w:t>
+      </w:r>
+      <w:proofErr w:type="gramStart"/>
+      <w:r>
+        <w:rPr>
+          <w:rFonts w:ascii="Times New Roman" w:hAnsi="Times New Roman" w:cs="Times New Roman"/>
+          <w:sz w:val="24"/>
+          <w:szCs w:val="24"/>
+        </w:rPr>
+        <w:t>trauma./</w:t>
+      </w:r>
+      <w:proofErr w:type="gramEnd"/>
+      <w:r>
+        <w:rPr>
+          <w:rFonts w:ascii="Times New Roman" w:hAnsi="Times New Roman" w:cs="Times New Roman"/>
+          <w:sz w:val="24"/>
+          <w:szCs w:val="24"/>
+        </w:rPr>
+        <w:t xml:space="preserve">There is a previous history of </w:t>
+      </w:r>
+      <w:proofErr w:type="gramStart"/>
+      <w:r>
+        <w:rPr>
+          <w:rFonts w:ascii="Times New Roman" w:hAnsi="Times New Roman" w:cs="Times New Roman"/>
+          <w:sz w:val="24"/>
+          <w:szCs w:val="24"/>
+        </w:rPr>
+        <w:t>trauma./</w:t>
+      </w:r>
+      <w:proofErr w:type="gramEnd"/>
+      <w:r>
+        <w:rPr>
+          <w:rFonts w:ascii="Times New Roman" w:hAnsi="Times New Roman" w:cs="Times New Roman"/>
+          <w:sz w:val="24"/>
+          <w:szCs w:val="24"/>
+        </w:rPr>
+        <w:t xml:space="preserve"> The patient was asymptomatic / symptomatic prior to the accident.</w:t>
       </w:r>
     </w:p>
     <w:p>
@@ -1141,7 +1092,6 @@
           <w:sz w:val="24"/>
           <w:szCs w:val="24"/>
         </w:rPr>
-        <w:lastRenderedPageBreak/>
         <w:t>None.</w:t>
       </w:r>
     </w:p>
@@ -1266,7 +1216,25 @@
           <w:sz w:val="24"/>
           <w:szCs w:val="24"/>
         </w:rPr>
-        <w:t>The patient ____drinks alcohol occasionally./The patient does not drink alcohol.</w:t>
+        <w:t xml:space="preserve">The patient ____drinks alcohol </w:t>
+      </w:r>
+      <w:proofErr w:type="gramStart"/>
+      <w:r>
+        <w:rPr>
+          <w:rFonts w:ascii="Times New Roman" w:hAnsi="Times New Roman" w:cs="Times New Roman"/>
+          <w:sz w:val="24"/>
+          <w:szCs w:val="24"/>
+        </w:rPr>
+        <w:t>occasionally./</w:t>
+      </w:r>
+      <w:proofErr w:type="gramEnd"/>
+      <w:r>
+        <w:rPr>
+          <w:rFonts w:ascii="Times New Roman" w:hAnsi="Times New Roman" w:cs="Times New Roman"/>
+          <w:sz w:val="24"/>
+          <w:szCs w:val="24"/>
+        </w:rPr>
+        <w:t>The patient does not drink alcohol.</w:t>
       </w:r>
       <w:r>
         <w:rPr>
@@ -1304,8 +1272,9 @@
           <w:sz w:val="24"/>
           <w:szCs w:val="24"/>
         </w:rPr>
-        <w:t>patient does not use recreational drugs.</w:t>
-      </w:r>
+        <w:t xml:space="preserve">patient does not use recreational </w:t>
+      </w:r>
+      <w:proofErr w:type="gramStart"/>
       <w:r>
         <w:rPr>
           <w:rFonts w:ascii="Times New Roman" w:eastAsia="Times New Roman" w:hAnsi="Times New Roman" w:cs="Times New Roman"/>
@@ -1314,10 +1283,7 @@
           <w:sz w:val="24"/>
           <w:szCs w:val="24"/>
         </w:rPr>
-        <w:t>/</w:t>
-      </w:r>
-      <w:r>
-        <w:t xml:space="preserve"> </w:t>
+        <w:t>drugs.</w:t>
       </w:r>
       <w:r>
         <w:rPr>
@@ -1327,7 +1293,11 @@
           <w:sz w:val="24"/>
           <w:szCs w:val="24"/>
         </w:rPr>
-        <w:t>The</w:t>
+        <w:t>/</w:t>
+      </w:r>
+      <w:proofErr w:type="gramEnd"/>
+      <w:r>
+        <w:t xml:space="preserve"> </w:t>
       </w:r>
       <w:r>
         <w:rPr>
@@ -1337,7 +1307,7 @@
           <w:sz w:val="24"/>
           <w:szCs w:val="24"/>
         </w:rPr>
-        <w:t xml:space="preserve"> </w:t>
+        <w:t>The</w:t>
       </w:r>
       <w:r>
         <w:rPr>
@@ -1347,7 +1317,7 @@
           <w:sz w:val="24"/>
           <w:szCs w:val="24"/>
         </w:rPr>
-        <w:t>patient use</w:t>
+        <w:t xml:space="preserve"> </w:t>
       </w:r>
       <w:r>
         <w:rPr>
@@ -1357,7 +1327,7 @@
           <w:sz w:val="24"/>
           <w:szCs w:val="24"/>
         </w:rPr>
-        <w:t>s</w:t>
+        <w:t>patient use</w:t>
       </w:r>
       <w:r>
         <w:rPr>
@@ -1367,6 +1337,16 @@
           <w:sz w:val="24"/>
           <w:szCs w:val="24"/>
         </w:rPr>
+        <w:t>s</w:t>
+      </w:r>
+      <w:r>
+        <w:rPr>
+          <w:rFonts w:ascii="Times New Roman" w:eastAsia="Times New Roman" w:hAnsi="Times New Roman" w:cs="Times New Roman"/>
+          <w:color w:val="000000"/>
+          <w:spacing w:val="3"/>
+          <w:sz w:val="24"/>
+          <w:szCs w:val="24"/>
+        </w:rPr>
         <w:t xml:space="preserve"> recreational drugs.</w:t>
       </w:r>
     </w:p>
@@ -1415,6 +1395,7 @@
           <w:lang w:val="en-IN"/>
         </w:rPr>
       </w:pPr>
+      <w:proofErr w:type="gramStart"/>
       <w:r>
         <w:rPr>
           <w:rFonts w:ascii="Times New Roman" w:eastAsia="Calibri" w:hAnsi="Times New Roman" w:cs="Times New Roman"/>
@@ -1433,6 +1414,8 @@
         </w:rPr>
         <w:t>{{</w:t>
       </w:r>
+      <w:proofErr w:type="spellStart"/>
+      <w:proofErr w:type="gramEnd"/>
       <w:r>
         <w:rPr>
           <w:rFonts w:ascii="Times New Roman" w:eastAsia="Times New Roman" w:hAnsi="Times New Roman" w:cs="Times New Roman"/>
@@ -1443,6 +1426,7 @@
         </w:rPr>
         <w:t>GeneralROS</w:t>
       </w:r>
+      <w:proofErr w:type="spellEnd"/>
       <w:r>
         <w:rPr>
           <w:rFonts w:ascii="Times New Roman" w:eastAsia="Times New Roman" w:hAnsi="Times New Roman" w:cs="Times New Roman"/>
@@ -1463,6 +1447,7 @@
           <w:szCs w:val="24"/>
         </w:rPr>
       </w:pPr>
+      <w:proofErr w:type="gramStart"/>
       <w:r>
         <w:rPr>
           <w:rFonts w:ascii="Times New Roman" w:eastAsia="Calibri" w:hAnsi="Times New Roman" w:cs="Times New Roman"/>
@@ -1481,6 +1466,8 @@
         </w:rPr>
         <w:t>{{</w:t>
       </w:r>
+      <w:proofErr w:type="spellStart"/>
+      <w:proofErr w:type="gramEnd"/>
       <w:r>
         <w:rPr>
           <w:rFonts w:ascii="Times New Roman" w:eastAsia="Times New Roman" w:hAnsi="Times New Roman" w:cs="Times New Roman"/>
@@ -1491,6 +1478,7 @@
         </w:rPr>
         <w:t>SkinROS</w:t>
       </w:r>
+      <w:proofErr w:type="spellEnd"/>
       <w:r>
         <w:rPr>
           <w:rFonts w:ascii="Times New Roman" w:eastAsia="Times New Roman" w:hAnsi="Times New Roman" w:cs="Times New Roman"/>
@@ -1511,6 +1499,7 @@
           <w:szCs w:val="24"/>
         </w:rPr>
       </w:pPr>
+      <w:proofErr w:type="gramStart"/>
       <w:r>
         <w:rPr>
           <w:rFonts w:ascii="Times New Roman" w:eastAsia="Calibri" w:hAnsi="Times New Roman" w:cs="Times New Roman"/>
@@ -1527,6 +1516,7 @@
         </w:rPr>
         <w:t>{{</w:t>
       </w:r>
+      <w:proofErr w:type="gramEnd"/>
       <w:r>
         <w:rPr>
           <w:rFonts w:ascii="Times New Roman" w:eastAsia="Calibri" w:hAnsi="Times New Roman" w:cs="Times New Roman"/>
@@ -1555,6 +1545,7 @@
           <w:szCs w:val="24"/>
         </w:rPr>
       </w:pPr>
+      <w:proofErr w:type="gramStart"/>
       <w:r>
         <w:rPr>
           <w:rFonts w:ascii="Times New Roman" w:eastAsia="Calibri" w:hAnsi="Times New Roman" w:cs="Times New Roman"/>
@@ -1571,6 +1562,8 @@
         </w:rPr>
         <w:t>{{</w:t>
       </w:r>
+      <w:proofErr w:type="spellStart"/>
+      <w:proofErr w:type="gramEnd"/>
       <w:r>
         <w:rPr>
           <w:rFonts w:ascii="Times New Roman" w:eastAsia="Calibri" w:hAnsi="Times New Roman" w:cs="Times New Roman"/>
@@ -1579,6 +1572,7 @@
         </w:rPr>
         <w:t>NeckROS</w:t>
       </w:r>
+      <w:proofErr w:type="spellEnd"/>
       <w:r>
         <w:rPr>
           <w:rFonts w:ascii="Times New Roman" w:eastAsia="Calibri" w:hAnsi="Times New Roman" w:cs="Times New Roman"/>
@@ -1597,6 +1591,7 @@
           <w:szCs w:val="24"/>
         </w:rPr>
       </w:pPr>
+      <w:proofErr w:type="gramStart"/>
       <w:r>
         <w:rPr>
           <w:rFonts w:ascii="Times New Roman" w:eastAsia="Calibri" w:hAnsi="Times New Roman" w:cs="Times New Roman"/>
@@ -1613,6 +1608,8 @@
         </w:rPr>
         <w:t>{{</w:t>
       </w:r>
+      <w:proofErr w:type="spellStart"/>
+      <w:proofErr w:type="gramEnd"/>
       <w:r>
         <w:rPr>
           <w:rFonts w:ascii="Times New Roman" w:eastAsia="Calibri" w:hAnsi="Times New Roman" w:cs="Times New Roman"/>
@@ -1621,6 +1618,7 @@
         </w:rPr>
         <w:t>CardiovascularROS</w:t>
       </w:r>
+      <w:proofErr w:type="spellEnd"/>
       <w:r>
         <w:rPr>
           <w:rFonts w:ascii="Times New Roman" w:eastAsia="Calibri" w:hAnsi="Times New Roman" w:cs="Times New Roman"/>
@@ -1639,6 +1637,7 @@
           <w:szCs w:val="24"/>
         </w:rPr>
       </w:pPr>
+      <w:proofErr w:type="gramStart"/>
       <w:r>
         <w:rPr>
           <w:rFonts w:ascii="Times New Roman" w:eastAsia="Calibri" w:hAnsi="Times New Roman" w:cs="Times New Roman"/>
@@ -1655,6 +1654,8 @@
         </w:rPr>
         <w:t>{{</w:t>
       </w:r>
+      <w:proofErr w:type="spellStart"/>
+      <w:proofErr w:type="gramEnd"/>
       <w:r>
         <w:rPr>
           <w:rFonts w:ascii="Times New Roman" w:eastAsia="Calibri" w:hAnsi="Times New Roman" w:cs="Times New Roman"/>
@@ -1663,6 +1664,7 @@
         </w:rPr>
         <w:t>RespiratoryROS</w:t>
       </w:r>
+      <w:proofErr w:type="spellEnd"/>
       <w:r>
         <w:rPr>
           <w:rFonts w:ascii="Times New Roman" w:eastAsia="Calibri" w:hAnsi="Times New Roman" w:cs="Times New Roman"/>
@@ -1681,6 +1683,7 @@
           <w:szCs w:val="24"/>
         </w:rPr>
       </w:pPr>
+      <w:proofErr w:type="gramStart"/>
       <w:r>
         <w:rPr>
           <w:rFonts w:ascii="Times New Roman" w:eastAsia="Calibri" w:hAnsi="Times New Roman" w:cs="Times New Roman"/>
@@ -1697,6 +1700,8 @@
         </w:rPr>
         <w:t>{{</w:t>
       </w:r>
+      <w:proofErr w:type="spellStart"/>
+      <w:proofErr w:type="gramEnd"/>
       <w:r>
         <w:rPr>
           <w:rFonts w:ascii="Times New Roman" w:eastAsia="Calibri" w:hAnsi="Times New Roman" w:cs="Times New Roman"/>
@@ -1705,6 +1710,7 @@
         </w:rPr>
         <w:t>GastrointestinalROS</w:t>
       </w:r>
+      <w:proofErr w:type="spellEnd"/>
       <w:r>
         <w:rPr>
           <w:rFonts w:ascii="Times New Roman" w:eastAsia="Calibri" w:hAnsi="Times New Roman" w:cs="Times New Roman"/>
@@ -1723,6 +1729,7 @@
           <w:szCs w:val="24"/>
         </w:rPr>
       </w:pPr>
+      <w:proofErr w:type="gramStart"/>
       <w:r>
         <w:rPr>
           <w:rFonts w:ascii="Times New Roman" w:eastAsia="Calibri" w:hAnsi="Times New Roman" w:cs="Times New Roman"/>
@@ -1739,6 +1746,8 @@
         </w:rPr>
         <w:t>{{</w:t>
       </w:r>
+      <w:proofErr w:type="spellStart"/>
+      <w:proofErr w:type="gramEnd"/>
       <w:r>
         <w:rPr>
           <w:rFonts w:ascii="Times New Roman" w:eastAsia="Calibri" w:hAnsi="Times New Roman" w:cs="Times New Roman"/>
@@ -1747,6 +1756,7 @@
         </w:rPr>
         <w:t>UrinaryROS</w:t>
       </w:r>
+      <w:proofErr w:type="spellEnd"/>
       <w:r>
         <w:rPr>
           <w:rFonts w:ascii="Times New Roman" w:eastAsia="Calibri" w:hAnsi="Times New Roman" w:cs="Times New Roman"/>
@@ -1771,16 +1781,27 @@
           <w:sz w:val="24"/>
           <w:szCs w:val="24"/>
         </w:rPr>
-        <w:t xml:space="preserve">PERIPHERAL VASCULAR: </w:t>
-      </w:r>
+        <w:t xml:space="preserve">PERIPHERAL </w:t>
+      </w:r>
+      <w:proofErr w:type="gramStart"/>
       <w:r>
         <w:rPr>
           <w:rFonts w:ascii="Times New Roman" w:eastAsia="Calibri" w:hAnsi="Times New Roman" w:cs="Times New Roman"/>
           <w:sz w:val="24"/>
           <w:szCs w:val="24"/>
         </w:rPr>
+        <w:t xml:space="preserve">VASCULAR: </w:t>
+      </w:r>
+      <w:r>
+        <w:rPr>
+          <w:rFonts w:ascii="Times New Roman" w:eastAsia="Calibri" w:hAnsi="Times New Roman" w:cs="Times New Roman"/>
+          <w:sz w:val="24"/>
+          <w:szCs w:val="24"/>
+        </w:rPr>
         <w:t>{{</w:t>
       </w:r>
+      <w:proofErr w:type="spellStart"/>
+      <w:proofErr w:type="gramEnd"/>
       <w:r>
         <w:rPr>
           <w:rFonts w:ascii="Times New Roman" w:eastAsia="Calibri" w:hAnsi="Times New Roman" w:cs="Times New Roman"/>
@@ -1789,6 +1810,7 @@
         </w:rPr>
         <w:t>PeripheralvascularROS</w:t>
       </w:r>
+      <w:proofErr w:type="spellEnd"/>
       <w:r>
         <w:rPr>
           <w:rFonts w:ascii="Times New Roman" w:eastAsia="Calibri" w:hAnsi="Times New Roman" w:cs="Times New Roman"/>
@@ -1807,6 +1829,7 @@
           <w:szCs w:val="24"/>
         </w:rPr>
       </w:pPr>
+      <w:proofErr w:type="gramStart"/>
       <w:r>
         <w:rPr>
           <w:rFonts w:ascii="Times New Roman" w:eastAsia="Calibri" w:hAnsi="Times New Roman" w:cs="Times New Roman"/>
@@ -1823,6 +1846,8 @@
         </w:rPr>
         <w:t>{{</w:t>
       </w:r>
+      <w:proofErr w:type="spellStart"/>
+      <w:proofErr w:type="gramEnd"/>
       <w:r>
         <w:rPr>
           <w:rFonts w:ascii="Times New Roman" w:eastAsia="Calibri" w:hAnsi="Times New Roman" w:cs="Times New Roman"/>
@@ -1831,6 +1856,7 @@
         </w:rPr>
         <w:t>MusculoskeletalROS</w:t>
       </w:r>
+      <w:proofErr w:type="spellEnd"/>
       <w:r>
         <w:rPr>
           <w:rFonts w:ascii="Times New Roman" w:eastAsia="Calibri" w:hAnsi="Times New Roman" w:cs="Times New Roman"/>
@@ -1865,6 +1891,7 @@
         </w:rPr>
         <w:t>{{</w:t>
       </w:r>
+      <w:proofErr w:type="spellStart"/>
       <w:r>
         <w:rPr>
           <w:rFonts w:ascii="Times New Roman" w:eastAsia="Calibri" w:hAnsi="Times New Roman" w:cs="Times New Roman"/>
@@ -1873,6 +1900,7 @@
         </w:rPr>
         <w:t>NeurologicalROS</w:t>
       </w:r>
+      <w:proofErr w:type="spellEnd"/>
       <w:r>
         <w:rPr>
           <w:rFonts w:ascii="Times New Roman" w:eastAsia="Calibri" w:hAnsi="Times New Roman" w:cs="Times New Roman"/>
@@ -1907,6 +1935,7 @@
         </w:rPr>
         <w:t>{{</w:t>
       </w:r>
+      <w:proofErr w:type="spellStart"/>
       <w:r>
         <w:rPr>
           <w:rFonts w:ascii="Times New Roman" w:eastAsia="Calibri" w:hAnsi="Times New Roman" w:cs="Times New Roman"/>
@@ -1916,6 +1945,7 @@
         </w:rPr>
         <w:t>EndocrineROS</w:t>
       </w:r>
+      <w:proofErr w:type="spellEnd"/>
       <w:r>
         <w:rPr>
           <w:rFonts w:ascii="Times New Roman" w:eastAsia="Calibri" w:hAnsi="Times New Roman" w:cs="Times New Roman"/>
@@ -2047,15 +2077,33 @@
           <w:sz w:val="24"/>
           <w:szCs w:val="24"/>
         </w:rPr>
-        <w:t>t i</w:t>
-      </w:r>
-      <w:r>
-        <w:rPr>
-          <w:rFonts w:ascii="Times New Roman" w:hAnsi="Times New Roman" w:cs="Times New Roman"/>
-          <w:sz w:val="24"/>
-          <w:szCs w:val="24"/>
-        </w:rPr>
-        <w:t xml:space="preserve">s </w:t>
+        <w:t xml:space="preserve">t </w:t>
+      </w:r>
+      <w:proofErr w:type="gramStart"/>
+      <w:r>
+        <w:rPr>
+          <w:rFonts w:ascii="Times New Roman" w:hAnsi="Times New Roman" w:cs="Times New Roman"/>
+          <w:sz w:val="24"/>
+          <w:szCs w:val="24"/>
+        </w:rPr>
+        <w:t>i</w:t>
+      </w:r>
+      <w:r>
+        <w:rPr>
+          <w:rFonts w:ascii="Times New Roman" w:hAnsi="Times New Roman" w:cs="Times New Roman"/>
+          <w:sz w:val="24"/>
+          <w:szCs w:val="24"/>
+        </w:rPr>
+        <w:t>s</w:t>
+      </w:r>
+      <w:proofErr w:type="gramEnd"/>
+      <w:r>
+        <w:rPr>
+          <w:rFonts w:ascii="Times New Roman" w:hAnsi="Times New Roman" w:cs="Times New Roman"/>
+          <w:sz w:val="24"/>
+          <w:szCs w:val="24"/>
+        </w:rPr>
+        <w:t xml:space="preserve"> </w:t>
       </w:r>
       <w:r>
         <w:rPr>
@@ -2095,7 +2143,25 @@
           <w:sz w:val="24"/>
           <w:szCs w:val="24"/>
         </w:rPr>
-        <w:t>Examination of the head, neck, chest, and abdomen is benign.</w:t>
+        <w:t xml:space="preserve">Examination of the head, neck, chest, and abdomen </w:t>
+      </w:r>
+      <w:proofErr w:type="gramStart"/>
+      <w:r>
+        <w:rPr>
+          <w:rFonts w:ascii="Times New Roman" w:hAnsi="Times New Roman" w:cs="Times New Roman"/>
+          <w:sz w:val="24"/>
+          <w:szCs w:val="24"/>
+        </w:rPr>
+        <w:t>is</w:t>
+      </w:r>
+      <w:proofErr w:type="gramEnd"/>
+      <w:r>
+        <w:rPr>
+          <w:rFonts w:ascii="Times New Roman" w:hAnsi="Times New Roman" w:cs="Times New Roman"/>
+          <w:sz w:val="24"/>
+          <w:szCs w:val="24"/>
+        </w:rPr>
+        <w:t xml:space="preserve"> benign.</w:t>
       </w:r>
       <w:r>
         <w:rPr>
@@ -2269,6 +2335,7 @@
           <w:szCs w:val="24"/>
         </w:rPr>
       </w:pPr>
+      <w:proofErr w:type="gramStart"/>
       <w:r>
         <w:rPr>
           <w:rFonts w:ascii="Times New Roman" w:hAnsi="Times New Roman" w:cs="Times New Roman"/>
@@ -2306,18 +2373,29 @@
           <w:sz w:val="24"/>
           <w:szCs w:val="24"/>
         </w:rPr>
-        <w:t>{{Inspection}}</w:t>
-      </w:r>
-    </w:p>
-    <w:p>
-      <w:pPr>
-        <w:spacing w:after="0" w:line="240" w:lineRule="auto"/>
-        <w:rPr>
-          <w:rFonts w:ascii="Times New Roman" w:hAnsi="Times New Roman" w:cs="Times New Roman"/>
-          <w:sz w:val="24"/>
-          <w:szCs w:val="24"/>
-        </w:rPr>
-      </w:pPr>
+        <w:t>{{</w:t>
+      </w:r>
+      <w:proofErr w:type="gramEnd"/>
+      <w:r>
+        <w:rPr>
+          <w:rFonts w:ascii="Times New Roman" w:hAnsi="Times New Roman" w:cs="Times New Roman"/>
+          <w:bCs/>
+          <w:sz w:val="24"/>
+          <w:szCs w:val="24"/>
+        </w:rPr>
+        <w:t>Inspection}}</w:t>
+      </w:r>
+    </w:p>
+    <w:p>
+      <w:pPr>
+        <w:spacing w:after="0" w:line="240" w:lineRule="auto"/>
+        <w:rPr>
+          <w:rFonts w:ascii="Times New Roman" w:hAnsi="Times New Roman" w:cs="Times New Roman"/>
+          <w:sz w:val="24"/>
+          <w:szCs w:val="24"/>
+        </w:rPr>
+      </w:pPr>
+      <w:proofErr w:type="gramStart"/>
       <w:r>
         <w:rPr>
           <w:rFonts w:ascii="Times New Roman" w:hAnsi="Times New Roman" w:cs="Times New Roman"/>
@@ -2343,6 +2421,7 @@
         </w:rPr>
         <w:t>{{</w:t>
       </w:r>
+      <w:proofErr w:type="gramEnd"/>
       <w:r>
         <w:rPr>
           <w:rFonts w:ascii="Times New Roman" w:hAnsi="Times New Roman" w:cs="Times New Roman"/>
@@ -2492,6 +2571,7 @@
               </w:rPr>
               <w:t>{{</w:t>
             </w:r>
+            <w:proofErr w:type="spellStart"/>
             <w:r>
               <w:rPr>
                 <w:sz w:val="24"/>
@@ -2500,6 +2580,7 @@
               </w:rPr>
               <w:t>CervicalFlexion</w:t>
             </w:r>
+            <w:proofErr w:type="spellEnd"/>
             <w:r>
               <w:rPr>
                 <w:sz w:val="24"/>
@@ -2569,6 +2650,7 @@
               </w:rPr>
               <w:t>{{</w:t>
             </w:r>
+            <w:proofErr w:type="spellStart"/>
             <w:r>
               <w:rPr>
                 <w:sz w:val="24"/>
@@ -2577,6 +2659,7 @@
               </w:rPr>
               <w:t>CervicalExtension</w:t>
             </w:r>
+            <w:proofErr w:type="spellEnd"/>
             <w:r>
               <w:rPr>
                 <w:sz w:val="24"/>
@@ -2646,6 +2729,7 @@
               </w:rPr>
               <w:t>{{</w:t>
             </w:r>
+            <w:proofErr w:type="spellStart"/>
             <w:r>
               <w:rPr>
                 <w:sz w:val="24"/>
@@ -2654,6 +2738,7 @@
               </w:rPr>
               <w:t>CervicalLeftRotation</w:t>
             </w:r>
+            <w:proofErr w:type="spellEnd"/>
             <w:r>
               <w:rPr>
                 <w:sz w:val="24"/>
@@ -2723,6 +2808,7 @@
               </w:rPr>
               <w:t>{{</w:t>
             </w:r>
+            <w:proofErr w:type="spellStart"/>
             <w:r>
               <w:rPr>
                 <w:sz w:val="24"/>
@@ -2731,6 +2817,7 @@
               </w:rPr>
               <w:t>CervicalRightRotation</w:t>
             </w:r>
+            <w:proofErr w:type="spellEnd"/>
             <w:r>
               <w:rPr>
                 <w:sz w:val="24"/>
@@ -2800,6 +2887,7 @@
               </w:rPr>
               <w:t>{{</w:t>
             </w:r>
+            <w:proofErr w:type="spellStart"/>
             <w:r>
               <w:rPr>
                 <w:sz w:val="24"/>
@@ -2808,6 +2896,7 @@
               </w:rPr>
               <w:t>CervicalLeftLateralbending</w:t>
             </w:r>
+            <w:proofErr w:type="spellEnd"/>
             <w:r>
               <w:rPr>
                 <w:sz w:val="24"/>
@@ -2877,6 +2966,7 @@
               </w:rPr>
               <w:t>{{</w:t>
             </w:r>
+            <w:proofErr w:type="spellStart"/>
             <w:r>
               <w:rPr>
                 <w:sz w:val="24"/>
@@ -2885,6 +2975,7 @@
               </w:rPr>
               <w:t>CervicalrightLateralbending</w:t>
             </w:r>
+            <w:proofErr w:type="spellEnd"/>
             <w:r>
               <w:rPr>
                 <w:sz w:val="24"/>
@@ -2947,7 +3038,6 @@
           <w:szCs w:val="24"/>
           <w:shd w:val="clear" w:color="auto" w:fill="FFFFFF"/>
         </w:rPr>
-        <w:lastRenderedPageBreak/>
         <w:t>MOTOR</w:t>
       </w:r>
       <w:r>
@@ -3189,6 +3279,7 @@
                 <w:szCs w:val="24"/>
                 <w:shd w:val="clear" w:color="auto" w:fill="FFFFFF"/>
               </w:rPr>
+              <w:lastRenderedPageBreak/>
               <w:t>Right</w:t>
             </w:r>
           </w:p>
@@ -3208,6 +3299,7 @@
                 <w:shd w:val="clear" w:color="auto" w:fill="FFFFFF"/>
               </w:rPr>
             </w:pPr>
+            <w:proofErr w:type="gramStart"/>
             <w:r>
               <w:rPr>
                 <w:rFonts w:eastAsia="Times New Roman"/>
@@ -3218,6 +3310,7 @@
               </w:rPr>
               <w:t>{{</w:t>
             </w:r>
+            <w:proofErr w:type="spellStart"/>
             <w:r>
               <w:rPr>
                 <w:rFonts w:eastAsia="Times New Roman"/>
@@ -3229,6 +3322,7 @@
               </w:rPr>
               <w:t>CERVICALRightDeltoid</w:t>
             </w:r>
+            <w:proofErr w:type="spellEnd"/>
             <w:r>
               <w:rPr>
                 <w:rFonts w:eastAsia="Times New Roman"/>
@@ -3248,7 +3342,18 @@
                 <w:szCs w:val="24"/>
                 <w:shd w:val="clear" w:color="auto" w:fill="FFFFFF"/>
               </w:rPr>
-              <w:t>/5</w:t>
+              <w:t>/</w:t>
+            </w:r>
+            <w:proofErr w:type="gramEnd"/>
+            <w:r>
+              <w:rPr>
+                <w:rFonts w:eastAsia="Times New Roman"/>
+                <w:color w:val="000000" w:themeColor="text1"/>
+                <w:sz w:val="24"/>
+                <w:szCs w:val="24"/>
+                <w:shd w:val="clear" w:color="auto" w:fill="FFFFFF"/>
+              </w:rPr>
+              <w:t>5</w:t>
             </w:r>
           </w:p>
         </w:tc>
@@ -3266,6 +3371,7 @@
                 <w:shd w:val="clear" w:color="auto" w:fill="FFFFFF"/>
               </w:rPr>
             </w:pPr>
+            <w:proofErr w:type="gramStart"/>
             <w:r>
               <w:rPr>
                 <w:rFonts w:eastAsia="Times New Roman"/>
@@ -3276,6 +3382,7 @@
               </w:rPr>
               <w:t>{{</w:t>
             </w:r>
+            <w:proofErr w:type="spellStart"/>
             <w:r>
               <w:rPr>
                 <w:rFonts w:eastAsia="Times New Roman"/>
@@ -3287,6 +3394,7 @@
               </w:rPr>
               <w:t>CERVICALRightBiceps</w:t>
             </w:r>
+            <w:proofErr w:type="spellEnd"/>
             <w:r>
               <w:rPr>
                 <w:rFonts w:eastAsia="Times New Roman"/>
@@ -3305,7 +3413,18 @@
                 <w:szCs w:val="24"/>
                 <w:shd w:val="clear" w:color="auto" w:fill="FFFFFF"/>
               </w:rPr>
-              <w:t>/5</w:t>
+              <w:t>/</w:t>
+            </w:r>
+            <w:proofErr w:type="gramEnd"/>
+            <w:r>
+              <w:rPr>
+                <w:rFonts w:eastAsia="Times New Roman"/>
+                <w:color w:val="000000" w:themeColor="text1"/>
+                <w:sz w:val="24"/>
+                <w:szCs w:val="24"/>
+                <w:shd w:val="clear" w:color="auto" w:fill="FFFFFF"/>
+              </w:rPr>
+              <w:t>5</w:t>
             </w:r>
           </w:p>
         </w:tc>
@@ -3334,6 +3453,7 @@
               </w:rPr>
               <w:t>{{</w:t>
             </w:r>
+            <w:proofErr w:type="spellStart"/>
             <w:r>
               <w:rPr>
                 <w:rFonts w:eastAsia="Times New Roman"/>
@@ -3345,6 +3465,7 @@
               </w:rPr>
               <w:t>CERVICALRightTriceps</w:t>
             </w:r>
+            <w:proofErr w:type="spellEnd"/>
             <w:r>
               <w:rPr>
                 <w:rFonts w:eastAsia="Times New Roman"/>
@@ -3382,6 +3503,7 @@
                 <w:shd w:val="clear" w:color="auto" w:fill="FFFFFF"/>
               </w:rPr>
             </w:pPr>
+            <w:proofErr w:type="gramStart"/>
             <w:r>
               <w:rPr>
                 <w:rFonts w:eastAsia="Times New Roman"/>
@@ -3392,6 +3514,7 @@
               </w:rPr>
               <w:t>{{</w:t>
             </w:r>
+            <w:proofErr w:type="spellStart"/>
             <w:r>
               <w:rPr>
                 <w:rFonts w:eastAsia="Times New Roman"/>
@@ -3403,6 +3526,7 @@
               </w:rPr>
               <w:t>CERVICALRightWristext</w:t>
             </w:r>
+            <w:proofErr w:type="spellEnd"/>
             <w:r>
               <w:rPr>
                 <w:rFonts w:eastAsia="Times New Roman"/>
@@ -3421,7 +3545,18 @@
                 <w:szCs w:val="24"/>
                 <w:shd w:val="clear" w:color="auto" w:fill="FFFFFF"/>
               </w:rPr>
-              <w:t>/5</w:t>
+              <w:t>/</w:t>
+            </w:r>
+            <w:proofErr w:type="gramEnd"/>
+            <w:r>
+              <w:rPr>
+                <w:rFonts w:eastAsia="Times New Roman"/>
+                <w:color w:val="000000" w:themeColor="text1"/>
+                <w:sz w:val="24"/>
+                <w:szCs w:val="24"/>
+                <w:shd w:val="clear" w:color="auto" w:fill="FFFFFF"/>
+              </w:rPr>
+              <w:t>5</w:t>
             </w:r>
           </w:p>
         </w:tc>
@@ -3440,6 +3575,7 @@
                 <w:shd w:val="clear" w:color="auto" w:fill="FFFFFF"/>
               </w:rPr>
             </w:pPr>
+            <w:proofErr w:type="gramStart"/>
             <w:r>
               <w:rPr>
                 <w:rFonts w:eastAsia="Times New Roman"/>
@@ -3450,6 +3586,7 @@
               </w:rPr>
               <w:t>{{</w:t>
             </w:r>
+            <w:proofErr w:type="spellStart"/>
             <w:r>
               <w:rPr>
                 <w:rFonts w:eastAsia="Times New Roman"/>
@@ -3461,6 +3598,7 @@
               </w:rPr>
               <w:t>CERVICALRightWristflex</w:t>
             </w:r>
+            <w:proofErr w:type="spellEnd"/>
             <w:r>
               <w:rPr>
                 <w:rFonts w:eastAsia="Times New Roman"/>
@@ -3479,7 +3617,18 @@
                 <w:szCs w:val="24"/>
                 <w:shd w:val="clear" w:color="auto" w:fill="FFFFFF"/>
               </w:rPr>
-              <w:t>/5</w:t>
+              <w:t>/</w:t>
+            </w:r>
+            <w:proofErr w:type="gramEnd"/>
+            <w:r>
+              <w:rPr>
+                <w:rFonts w:eastAsia="Times New Roman"/>
+                <w:color w:val="000000" w:themeColor="text1"/>
+                <w:sz w:val="24"/>
+                <w:szCs w:val="24"/>
+                <w:shd w:val="clear" w:color="auto" w:fill="FFFFFF"/>
+              </w:rPr>
+              <w:t>5</w:t>
             </w:r>
           </w:p>
         </w:tc>
@@ -3588,6 +3737,7 @@
                 <w:shd w:val="clear" w:color="auto" w:fill="FFFFFF"/>
               </w:rPr>
             </w:pPr>
+            <w:proofErr w:type="gramStart"/>
             <w:r>
               <w:rPr>
                 <w:rFonts w:eastAsia="Times New Roman"/>
@@ -3598,6 +3748,7 @@
               </w:rPr>
               <w:t>{{</w:t>
             </w:r>
+            <w:proofErr w:type="spellStart"/>
             <w:r>
               <w:rPr>
                 <w:rFonts w:eastAsia="Times New Roman"/>
@@ -3609,6 +3760,7 @@
               </w:rPr>
               <w:t>CERVICALLEFTDeltoid</w:t>
             </w:r>
+            <w:proofErr w:type="spellEnd"/>
             <w:r>
               <w:rPr>
                 <w:rFonts w:eastAsia="Times New Roman"/>
@@ -3627,7 +3779,18 @@
                 <w:szCs w:val="24"/>
                 <w:shd w:val="clear" w:color="auto" w:fill="FFFFFF"/>
               </w:rPr>
-              <w:t>/5</w:t>
+              <w:t>/</w:t>
+            </w:r>
+            <w:proofErr w:type="gramEnd"/>
+            <w:r>
+              <w:rPr>
+                <w:rFonts w:eastAsia="Times New Roman"/>
+                <w:color w:val="000000" w:themeColor="text1"/>
+                <w:sz w:val="24"/>
+                <w:szCs w:val="24"/>
+                <w:shd w:val="clear" w:color="auto" w:fill="FFFFFF"/>
+              </w:rPr>
+              <w:t>5</w:t>
             </w:r>
           </w:p>
         </w:tc>
@@ -3646,6 +3809,7 @@
                 <w:shd w:val="clear" w:color="auto" w:fill="FFFFFF"/>
               </w:rPr>
             </w:pPr>
+            <w:proofErr w:type="gramStart"/>
             <w:r>
               <w:rPr>
                 <w:rFonts w:eastAsia="Times New Roman"/>
@@ -3656,6 +3820,7 @@
               </w:rPr>
               <w:t>{{</w:t>
             </w:r>
+            <w:proofErr w:type="spellStart"/>
             <w:r>
               <w:rPr>
                 <w:rFonts w:eastAsia="Times New Roman"/>
@@ -3667,6 +3832,7 @@
               </w:rPr>
               <w:t>CERVICALLEFTBiceps</w:t>
             </w:r>
+            <w:proofErr w:type="spellEnd"/>
             <w:r>
               <w:rPr>
                 <w:rFonts w:eastAsia="Times New Roman"/>
@@ -3685,7 +3851,18 @@
                 <w:szCs w:val="24"/>
                 <w:shd w:val="clear" w:color="auto" w:fill="FFFFFF"/>
               </w:rPr>
-              <w:t>/5</w:t>
+              <w:t>/</w:t>
+            </w:r>
+            <w:proofErr w:type="gramEnd"/>
+            <w:r>
+              <w:rPr>
+                <w:rFonts w:eastAsia="Times New Roman"/>
+                <w:color w:val="000000" w:themeColor="text1"/>
+                <w:sz w:val="24"/>
+                <w:szCs w:val="24"/>
+                <w:shd w:val="clear" w:color="auto" w:fill="FFFFFF"/>
+              </w:rPr>
+              <w:t>5</w:t>
             </w:r>
           </w:p>
         </w:tc>
@@ -3714,6 +3891,7 @@
               </w:rPr>
               <w:t>{{</w:t>
             </w:r>
+            <w:proofErr w:type="spellStart"/>
             <w:r>
               <w:rPr>
                 <w:rFonts w:eastAsia="Times New Roman"/>
@@ -3725,6 +3903,7 @@
               </w:rPr>
               <w:t>CERVICALLEFTTriceps</w:t>
             </w:r>
+            <w:proofErr w:type="spellEnd"/>
             <w:r>
               <w:rPr>
                 <w:rFonts w:eastAsia="Times New Roman"/>
@@ -3762,6 +3941,7 @@
                 <w:shd w:val="clear" w:color="auto" w:fill="FFFFFF"/>
               </w:rPr>
             </w:pPr>
+            <w:proofErr w:type="gramStart"/>
             <w:r>
               <w:rPr>
                 <w:rFonts w:eastAsia="Times New Roman"/>
@@ -3772,6 +3952,7 @@
               </w:rPr>
               <w:t>{{</w:t>
             </w:r>
+            <w:proofErr w:type="spellStart"/>
             <w:r>
               <w:rPr>
                 <w:rFonts w:eastAsia="Times New Roman"/>
@@ -3783,6 +3964,7 @@
               </w:rPr>
               <w:t>CERVICALLeftWristext</w:t>
             </w:r>
+            <w:proofErr w:type="spellEnd"/>
             <w:r>
               <w:rPr>
                 <w:rFonts w:eastAsia="Times New Roman"/>
@@ -3801,7 +3983,18 @@
                 <w:szCs w:val="24"/>
                 <w:shd w:val="clear" w:color="auto" w:fill="FFFFFF"/>
               </w:rPr>
-              <w:t>/5</w:t>
+              <w:t>/</w:t>
+            </w:r>
+            <w:proofErr w:type="gramEnd"/>
+            <w:r>
+              <w:rPr>
+                <w:rFonts w:eastAsia="Times New Roman"/>
+                <w:color w:val="000000" w:themeColor="text1"/>
+                <w:sz w:val="24"/>
+                <w:szCs w:val="24"/>
+                <w:shd w:val="clear" w:color="auto" w:fill="FFFFFF"/>
+              </w:rPr>
+              <w:t>5</w:t>
             </w:r>
           </w:p>
         </w:tc>
@@ -3820,6 +4013,7 @@
                 <w:shd w:val="clear" w:color="auto" w:fill="FFFFFF"/>
               </w:rPr>
             </w:pPr>
+            <w:proofErr w:type="gramStart"/>
             <w:r>
               <w:rPr>
                 <w:rFonts w:eastAsia="Times New Roman"/>
@@ -3830,6 +4024,7 @@
               </w:rPr>
               <w:t>{{</w:t>
             </w:r>
+            <w:proofErr w:type="spellStart"/>
             <w:r>
               <w:rPr>
                 <w:rFonts w:eastAsia="Times New Roman"/>
@@ -3841,6 +4036,7 @@
               </w:rPr>
               <w:t>CERVICALLEFTWristflex</w:t>
             </w:r>
+            <w:proofErr w:type="spellEnd"/>
             <w:r>
               <w:rPr>
                 <w:rFonts w:eastAsia="Times New Roman"/>
@@ -3859,7 +4055,18 @@
                 <w:szCs w:val="24"/>
                 <w:shd w:val="clear" w:color="auto" w:fill="FFFFFF"/>
               </w:rPr>
-              <w:t>/5</w:t>
+              <w:t>/</w:t>
+            </w:r>
+            <w:proofErr w:type="gramEnd"/>
+            <w:r>
+              <w:rPr>
+                <w:rFonts w:eastAsia="Times New Roman"/>
+                <w:color w:val="000000" w:themeColor="text1"/>
+                <w:sz w:val="24"/>
+                <w:szCs w:val="24"/>
+                <w:shd w:val="clear" w:color="auto" w:fill="FFFFFF"/>
+              </w:rPr>
+              <w:t>5</w:t>
             </w:r>
           </w:p>
         </w:tc>
@@ -3878,6 +4085,7 @@
                 <w:shd w:val="clear" w:color="auto" w:fill="FFFFFF"/>
               </w:rPr>
             </w:pPr>
+            <w:proofErr w:type="gramStart"/>
             <w:r>
               <w:rPr>
                 <w:rFonts w:eastAsia="Times New Roman"/>
@@ -3888,6 +4096,7 @@
               </w:rPr>
               <w:t>{{</w:t>
             </w:r>
+            <w:proofErr w:type="spellStart"/>
             <w:r>
               <w:rPr>
                 <w:rFonts w:eastAsia="Times New Roman"/>
@@ -3899,6 +4108,7 @@
               </w:rPr>
               <w:t>CERVICALLEFTIntrinsic</w:t>
             </w:r>
+            <w:proofErr w:type="spellEnd"/>
             <w:r>
               <w:rPr>
                 <w:rFonts w:eastAsia="Times New Roman"/>
@@ -3917,7 +4127,18 @@
                 <w:szCs w:val="24"/>
                 <w:shd w:val="clear" w:color="auto" w:fill="FFFFFF"/>
               </w:rPr>
-              <w:t>/5</w:t>
+              <w:t>/</w:t>
+            </w:r>
+            <w:proofErr w:type="gramEnd"/>
+            <w:r>
+              <w:rPr>
+                <w:rFonts w:eastAsia="Times New Roman"/>
+                <w:color w:val="000000" w:themeColor="text1"/>
+                <w:sz w:val="24"/>
+                <w:szCs w:val="24"/>
+                <w:shd w:val="clear" w:color="auto" w:fill="FFFFFF"/>
+              </w:rPr>
+              <w:t>5</w:t>
             </w:r>
           </w:p>
         </w:tc>
@@ -4833,6 +5054,7 @@
         </w:rPr>
         <w:t>{{</w:t>
       </w:r>
+      <w:proofErr w:type="spellStart"/>
       <w:r>
         <w:rPr>
           <w:rFonts w:ascii="Times New Roman" w:hAnsi="Times New Roman" w:cs="Times New Roman"/>
@@ -4842,6 +5064,7 @@
         </w:rPr>
         <w:t>CevicalSpurling</w:t>
       </w:r>
+      <w:proofErr w:type="spellEnd"/>
       <w:r>
         <w:rPr>
           <w:rFonts w:ascii="Times New Roman" w:hAnsi="Times New Roman" w:cs="Times New Roman"/>
@@ -4874,6 +5097,7 @@
         </w:rPr>
         <w:t>{{</w:t>
       </w:r>
+      <w:proofErr w:type="spellStart"/>
       <w:r>
         <w:rPr>
           <w:rFonts w:ascii="Times New Roman" w:hAnsi="Times New Roman" w:cs="Times New Roman"/>
@@ -4883,6 +5107,7 @@
         </w:rPr>
         <w:t>CevicalSpurlingTest</w:t>
       </w:r>
+      <w:proofErr w:type="spellEnd"/>
       <w:r>
         <w:rPr>
           <w:rFonts w:ascii="Times New Roman" w:hAnsi="Times New Roman" w:cs="Times New Roman"/>
@@ -4941,6 +5166,7 @@
         </w:rPr>
         <w:t>{{</w:t>
       </w:r>
+      <w:proofErr w:type="spellStart"/>
       <w:r>
         <w:rPr>
           <w:rFonts w:ascii="Times New Roman" w:hAnsi="Times New Roman" w:cs="Times New Roman"/>
@@ -4950,6 +5176,7 @@
         </w:rPr>
         <w:t>CevicalCompression</w:t>
       </w:r>
+      <w:proofErr w:type="spellEnd"/>
       <w:r>
         <w:rPr>
           <w:rFonts w:ascii="Times New Roman" w:hAnsi="Times New Roman" w:cs="Times New Roman"/>
@@ -4990,6 +5217,7 @@
         </w:rPr>
         <w:t>{{</w:t>
       </w:r>
+      <w:proofErr w:type="spellStart"/>
       <w:r>
         <w:rPr>
           <w:rFonts w:ascii="Times New Roman" w:hAnsi="Times New Roman" w:cs="Times New Roman"/>
@@ -4999,6 +5227,7 @@
         </w:rPr>
         <w:t>CevicalCompressionTest</w:t>
       </w:r>
+      <w:proofErr w:type="spellEnd"/>
       <w:r>
         <w:rPr>
           <w:rFonts w:ascii="Times New Roman" w:hAnsi="Times New Roman" w:cs="Times New Roman"/>
@@ -5185,6 +5414,7 @@
                 <w:shd w:val="clear" w:color="auto" w:fill="FFFFFF"/>
               </w:rPr>
             </w:pPr>
+            <w:proofErr w:type="gramStart"/>
             <w:r>
               <w:rPr>
                 <w:rFonts w:eastAsia="Times New Roman" w:cstheme="minorHAnsi"/>
@@ -5195,6 +5425,7 @@
               </w:rPr>
               <w:t>{{</w:t>
             </w:r>
+            <w:proofErr w:type="spellStart"/>
             <w:r>
               <w:rPr>
                 <w:rFonts w:eastAsia="Times New Roman" w:cstheme="minorHAnsi"/>
@@ -5206,6 +5437,7 @@
               </w:rPr>
               <w:t>THORACICBicepstendonright</w:t>
             </w:r>
+            <w:proofErr w:type="spellEnd"/>
             <w:r>
               <w:rPr>
                 <w:rFonts w:eastAsia="Times New Roman" w:cstheme="minorHAnsi"/>
@@ -5224,7 +5456,18 @@
                 <w:szCs w:val="24"/>
                 <w:shd w:val="clear" w:color="auto" w:fill="FFFFFF"/>
               </w:rPr>
-              <w:t>/4</w:t>
+              <w:t>/</w:t>
+            </w:r>
+            <w:proofErr w:type="gramEnd"/>
+            <w:r>
+              <w:rPr>
+                <w:rFonts w:eastAsia="Times New Roman" w:cstheme="minorHAnsi"/>
+                <w:color w:val="000000" w:themeColor="text1"/>
+                <w:sz w:val="24"/>
+                <w:szCs w:val="24"/>
+                <w:shd w:val="clear" w:color="auto" w:fill="FFFFFF"/>
+              </w:rPr>
+              <w:t>4</w:t>
             </w:r>
           </w:p>
         </w:tc>
@@ -5243,6 +5486,7 @@
                 <w:shd w:val="clear" w:color="auto" w:fill="FFFFFF"/>
               </w:rPr>
             </w:pPr>
+            <w:proofErr w:type="gramStart"/>
             <w:r>
               <w:rPr>
                 <w:rFonts w:eastAsia="Times New Roman" w:cstheme="minorHAnsi"/>
@@ -5253,6 +5497,7 @@
               </w:rPr>
               <w:t>{{</w:t>
             </w:r>
+            <w:proofErr w:type="spellStart"/>
             <w:r>
               <w:rPr>
                 <w:rFonts w:eastAsia="Times New Roman" w:cstheme="minorHAnsi"/>
@@ -5264,6 +5509,7 @@
               </w:rPr>
               <w:t>THORACICBicepstendonleft</w:t>
             </w:r>
+            <w:proofErr w:type="spellEnd"/>
             <w:r>
               <w:rPr>
                 <w:rFonts w:eastAsia="Times New Roman" w:cstheme="minorHAnsi"/>
@@ -5282,7 +5528,18 @@
                 <w:szCs w:val="24"/>
                 <w:shd w:val="clear" w:color="auto" w:fill="FFFFFF"/>
               </w:rPr>
-              <w:t>/4</w:t>
+              <w:t>/</w:t>
+            </w:r>
+            <w:proofErr w:type="gramEnd"/>
+            <w:r>
+              <w:rPr>
+                <w:rFonts w:eastAsia="Times New Roman" w:cstheme="minorHAnsi"/>
+                <w:color w:val="000000" w:themeColor="text1"/>
+                <w:sz w:val="24"/>
+                <w:szCs w:val="24"/>
+                <w:shd w:val="clear" w:color="auto" w:fill="FFFFFF"/>
+              </w:rPr>
+              <w:t>4</w:t>
             </w:r>
           </w:p>
         </w:tc>
@@ -5330,6 +5587,7 @@
                 <w:shd w:val="clear" w:color="auto" w:fill="FFFFFF"/>
               </w:rPr>
             </w:pPr>
+            <w:proofErr w:type="gramStart"/>
             <w:r>
               <w:rPr>
                 <w:rFonts w:eastAsia="Times New Roman" w:cstheme="minorHAnsi"/>
@@ -5340,6 +5598,7 @@
               </w:rPr>
               <w:t>{{</w:t>
             </w:r>
+            <w:proofErr w:type="spellStart"/>
             <w:r>
               <w:rPr>
                 <w:rFonts w:eastAsia="Times New Roman" w:cstheme="minorHAnsi"/>
@@ -5351,6 +5610,7 @@
               </w:rPr>
               <w:t>THORACICTricepstendonright</w:t>
             </w:r>
+            <w:proofErr w:type="spellEnd"/>
             <w:r>
               <w:rPr>
                 <w:rFonts w:eastAsia="Times New Roman" w:cstheme="minorHAnsi"/>
@@ -5369,7 +5629,18 @@
                 <w:szCs w:val="24"/>
                 <w:shd w:val="clear" w:color="auto" w:fill="FFFFFF"/>
               </w:rPr>
-              <w:t>/4</w:t>
+              <w:t>/</w:t>
+            </w:r>
+            <w:proofErr w:type="gramEnd"/>
+            <w:r>
+              <w:rPr>
+                <w:rFonts w:eastAsia="Times New Roman" w:cstheme="minorHAnsi"/>
+                <w:color w:val="000000" w:themeColor="text1"/>
+                <w:sz w:val="24"/>
+                <w:szCs w:val="24"/>
+                <w:shd w:val="clear" w:color="auto" w:fill="FFFFFF"/>
+              </w:rPr>
+              <w:t>4</w:t>
             </w:r>
           </w:p>
         </w:tc>
@@ -5388,6 +5659,7 @@
                 <w:shd w:val="clear" w:color="auto" w:fill="FFFFFF"/>
               </w:rPr>
             </w:pPr>
+            <w:proofErr w:type="gramStart"/>
             <w:r>
               <w:rPr>
                 <w:rFonts w:eastAsia="Times New Roman" w:cstheme="minorHAnsi"/>
@@ -5398,6 +5670,7 @@
               </w:rPr>
               <w:t>{{</w:t>
             </w:r>
+            <w:proofErr w:type="spellStart"/>
             <w:r>
               <w:rPr>
                 <w:rFonts w:eastAsia="Times New Roman" w:cstheme="minorHAnsi"/>
@@ -5409,6 +5682,7 @@
               </w:rPr>
               <w:t>THORACICTricepstendonleft</w:t>
             </w:r>
+            <w:proofErr w:type="spellEnd"/>
             <w:r>
               <w:rPr>
                 <w:rFonts w:eastAsia="Times New Roman" w:cstheme="minorHAnsi"/>
@@ -5427,7 +5701,18 @@
                 <w:szCs w:val="24"/>
                 <w:shd w:val="clear" w:color="auto" w:fill="FFFFFF"/>
               </w:rPr>
-              <w:t>/4</w:t>
+              <w:t>/</w:t>
+            </w:r>
+            <w:proofErr w:type="gramEnd"/>
+            <w:r>
+              <w:rPr>
+                <w:rFonts w:eastAsia="Times New Roman" w:cstheme="minorHAnsi"/>
+                <w:color w:val="000000" w:themeColor="text1"/>
+                <w:sz w:val="24"/>
+                <w:szCs w:val="24"/>
+                <w:shd w:val="clear" w:color="auto" w:fill="FFFFFF"/>
+              </w:rPr>
+              <w:t>4</w:t>
             </w:r>
           </w:p>
         </w:tc>
@@ -5783,6 +6068,7 @@
               </w:rPr>
               <w:t>{{</w:t>
             </w:r>
+            <w:proofErr w:type="spellStart"/>
             <w:r>
               <w:rPr>
                 <w:sz w:val="24"/>
@@ -5791,6 +6077,7 @@
               </w:rPr>
               <w:t>LUMBARFlexion</w:t>
             </w:r>
+            <w:proofErr w:type="spellEnd"/>
             <w:r>
               <w:rPr>
                 <w:sz w:val="24"/>
@@ -5860,6 +6147,7 @@
               </w:rPr>
               <w:t>{{</w:t>
             </w:r>
+            <w:proofErr w:type="spellStart"/>
             <w:r>
               <w:rPr>
                 <w:sz w:val="24"/>
@@ -5868,6 +6156,7 @@
               </w:rPr>
               <w:t>LUMBARExtension</w:t>
             </w:r>
+            <w:proofErr w:type="spellEnd"/>
             <w:r>
               <w:rPr>
                 <w:sz w:val="24"/>
@@ -5944,6 +6233,7 @@
               </w:rPr>
               <w:t>{{</w:t>
             </w:r>
+            <w:proofErr w:type="spellStart"/>
             <w:r>
               <w:rPr>
                 <w:sz w:val="24"/>
@@ -5952,6 +6242,7 @@
               </w:rPr>
               <w:t>LUMBARLeftRotation</w:t>
             </w:r>
+            <w:proofErr w:type="spellEnd"/>
             <w:r>
               <w:rPr>
                 <w:sz w:val="24"/>
@@ -6028,6 +6319,7 @@
               </w:rPr>
               <w:t>{{</w:t>
             </w:r>
+            <w:proofErr w:type="spellStart"/>
             <w:r>
               <w:rPr>
                 <w:sz w:val="24"/>
@@ -6036,6 +6328,7 @@
               </w:rPr>
               <w:t>LUMBARRightRotation</w:t>
             </w:r>
+            <w:proofErr w:type="spellEnd"/>
             <w:r>
               <w:rPr>
                 <w:sz w:val="24"/>
@@ -6112,6 +6405,7 @@
               </w:rPr>
               <w:t>{{</w:t>
             </w:r>
+            <w:proofErr w:type="spellStart"/>
             <w:r>
               <w:rPr>
                 <w:sz w:val="24"/>
@@ -6120,6 +6414,7 @@
               </w:rPr>
               <w:t>LUMBARLeftLateralbending</w:t>
             </w:r>
+            <w:proofErr w:type="spellEnd"/>
             <w:r>
               <w:rPr>
                 <w:sz w:val="24"/>
@@ -6196,6 +6491,7 @@
               </w:rPr>
               <w:t>{{</w:t>
             </w:r>
+            <w:proofErr w:type="spellStart"/>
             <w:r>
               <w:rPr>
                 <w:sz w:val="24"/>
@@ -6204,6 +6500,7 @@
               </w:rPr>
               <w:t>LUMBARightLateralbending</w:t>
             </w:r>
+            <w:proofErr w:type="spellEnd"/>
             <w:r>
               <w:rPr>
                 <w:sz w:val="24"/>
@@ -6497,6 +6794,7 @@
                 <w:shd w:val="clear" w:color="auto" w:fill="FFFFFF"/>
               </w:rPr>
             </w:pPr>
+            <w:proofErr w:type="gramStart"/>
             <w:r>
               <w:rPr>
                 <w:rFonts w:eastAsia="Times New Roman"/>
@@ -6508,6 +6806,7 @@
               </w:rPr>
               <w:t>{{</w:t>
             </w:r>
+            <w:proofErr w:type="spellStart"/>
             <w:r>
               <w:rPr>
                 <w:rFonts w:eastAsia="Times New Roman"/>
@@ -6520,6 +6819,7 @@
               </w:rPr>
               <w:t>LUMBARRightIliopsoas</w:t>
             </w:r>
+            <w:proofErr w:type="spellEnd"/>
             <w:r>
               <w:rPr>
                 <w:rFonts w:eastAsia="Times New Roman"/>
@@ -6542,6 +6842,7 @@
               </w:rPr>
               <w:t>/</w:t>
             </w:r>
+            <w:proofErr w:type="gramEnd"/>
             <w:r>
               <w:rPr>
                 <w:rFonts w:eastAsia="Times New Roman"/>
@@ -6569,6 +6870,7 @@
                 <w:shd w:val="clear" w:color="auto" w:fill="FFFFFF"/>
               </w:rPr>
             </w:pPr>
+            <w:proofErr w:type="gramStart"/>
             <w:r>
               <w:rPr>
                 <w:rFonts w:eastAsia="Times New Roman"/>
@@ -6580,6 +6882,7 @@
               </w:rPr>
               <w:t>{{</w:t>
             </w:r>
+            <w:proofErr w:type="spellStart"/>
             <w:r>
               <w:rPr>
                 <w:rFonts w:eastAsia="Times New Roman"/>
@@ -6592,6 +6895,7 @@
               </w:rPr>
               <w:t>LUMBARRightQuadriceps</w:t>
             </w:r>
+            <w:proofErr w:type="spellEnd"/>
             <w:r>
               <w:rPr>
                 <w:rFonts w:eastAsia="Times New Roman"/>
@@ -6611,7 +6915,18 @@
                 <w:szCs w:val="24"/>
                 <w:shd w:val="clear" w:color="auto" w:fill="FFFFFF"/>
               </w:rPr>
-              <w:t>/5</w:t>
+              <w:t>/</w:t>
+            </w:r>
+            <w:proofErr w:type="gramEnd"/>
+            <w:r>
+              <w:rPr>
+                <w:rFonts w:eastAsia="Times New Roman"/>
+                <w:color w:val="000000" w:themeColor="text1"/>
+                <w:sz w:val="24"/>
+                <w:szCs w:val="24"/>
+                <w:shd w:val="clear" w:color="auto" w:fill="FFFFFF"/>
+              </w:rPr>
+              <w:t>5</w:t>
             </w:r>
           </w:p>
         </w:tc>
@@ -6630,6 +6945,7 @@
                 <w:shd w:val="clear" w:color="auto" w:fill="FFFFFF"/>
               </w:rPr>
             </w:pPr>
+            <w:proofErr w:type="gramStart"/>
             <w:r>
               <w:rPr>
                 <w:rFonts w:eastAsia="Times New Roman"/>
@@ -6641,6 +6957,7 @@
               </w:rPr>
               <w:t>{{</w:t>
             </w:r>
+            <w:proofErr w:type="spellStart"/>
             <w:r>
               <w:rPr>
                 <w:rFonts w:eastAsia="Times New Roman"/>
@@ -6653,6 +6970,7 @@
               </w:rPr>
               <w:t>LUMBARRightHamstrings</w:t>
             </w:r>
+            <w:proofErr w:type="spellEnd"/>
             <w:r>
               <w:rPr>
                 <w:rFonts w:eastAsia="Times New Roman"/>
@@ -6672,7 +6990,18 @@
                 <w:szCs w:val="24"/>
                 <w:shd w:val="clear" w:color="auto" w:fill="FFFFFF"/>
               </w:rPr>
-              <w:t>/5</w:t>
+              <w:t>/</w:t>
+            </w:r>
+            <w:proofErr w:type="gramEnd"/>
+            <w:r>
+              <w:rPr>
+                <w:rFonts w:eastAsia="Times New Roman"/>
+                <w:color w:val="000000" w:themeColor="text1"/>
+                <w:sz w:val="24"/>
+                <w:szCs w:val="24"/>
+                <w:shd w:val="clear" w:color="auto" w:fill="FFFFFF"/>
+              </w:rPr>
+              <w:t>5</w:t>
             </w:r>
           </w:p>
         </w:tc>
@@ -6691,6 +7020,7 @@
                 <w:shd w:val="clear" w:color="auto" w:fill="FFFFFF"/>
               </w:rPr>
             </w:pPr>
+            <w:proofErr w:type="gramStart"/>
             <w:r>
               <w:rPr>
                 <w:rFonts w:eastAsia="Times New Roman"/>
@@ -6702,6 +7032,7 @@
               </w:rPr>
               <w:t>{{</w:t>
             </w:r>
+            <w:proofErr w:type="spellStart"/>
             <w:r>
               <w:rPr>
                 <w:rFonts w:eastAsia="Times New Roman"/>
@@ -6714,6 +7045,7 @@
               </w:rPr>
               <w:t>LUMBARRightTibant</w:t>
             </w:r>
+            <w:proofErr w:type="spellEnd"/>
             <w:r>
               <w:rPr>
                 <w:rFonts w:eastAsia="Times New Roman"/>
@@ -6733,7 +7065,18 @@
                 <w:szCs w:val="24"/>
                 <w:shd w:val="clear" w:color="auto" w:fill="FFFFFF"/>
               </w:rPr>
-              <w:t>/5</w:t>
+              <w:t>/</w:t>
+            </w:r>
+            <w:proofErr w:type="gramEnd"/>
+            <w:r>
+              <w:rPr>
+                <w:rFonts w:eastAsia="Times New Roman"/>
+                <w:color w:val="000000" w:themeColor="text1"/>
+                <w:sz w:val="24"/>
+                <w:szCs w:val="24"/>
+                <w:shd w:val="clear" w:color="auto" w:fill="FFFFFF"/>
+              </w:rPr>
+              <w:t>5</w:t>
             </w:r>
           </w:p>
         </w:tc>
@@ -6762,7 +7105,33 @@
                 <w:shd w:val="clear" w:color="auto" w:fill="FFFFFF"/>
                 <w:lang w:val="en-IN"/>
               </w:rPr>
-              <w:t>{{LUMBARRightEHL}}</w:t>
+              <w:t>{{</w:t>
+            </w:r>
+            <w:proofErr w:type="spellStart"/>
+            <w:r>
+              <w:rPr>
+                <w:rFonts w:eastAsia="Times New Roman"/>
+                <w:color w:val="000000" w:themeColor="text1"/>
+                <w:sz w:val="24"/>
+                <w:szCs w:val="24"/>
+                <w:u w:val="single"/>
+                <w:shd w:val="clear" w:color="auto" w:fill="FFFFFF"/>
+                <w:lang w:val="en-IN"/>
+              </w:rPr>
+              <w:t>LUMBARRightEHL</w:t>
+            </w:r>
+            <w:proofErr w:type="spellEnd"/>
+            <w:r>
+              <w:rPr>
+                <w:rFonts w:eastAsia="Times New Roman"/>
+                <w:color w:val="000000" w:themeColor="text1"/>
+                <w:sz w:val="24"/>
+                <w:szCs w:val="24"/>
+                <w:u w:val="single"/>
+                <w:shd w:val="clear" w:color="auto" w:fill="FFFFFF"/>
+                <w:lang w:val="en-IN"/>
+              </w:rPr>
+              <w:t>}}</w:t>
             </w:r>
             <w:r>
               <w:rPr>
@@ -6791,6 +7160,7 @@
                 <w:shd w:val="clear" w:color="auto" w:fill="FFFFFF"/>
               </w:rPr>
             </w:pPr>
+            <w:proofErr w:type="gramStart"/>
             <w:r>
               <w:rPr>
                 <w:rFonts w:eastAsia="Times New Roman"/>
@@ -6802,6 +7172,7 @@
               </w:rPr>
               <w:t>{{</w:t>
             </w:r>
+            <w:proofErr w:type="spellStart"/>
             <w:r>
               <w:rPr>
                 <w:rFonts w:eastAsia="Times New Roman"/>
@@ -6814,6 +7185,7 @@
               </w:rPr>
               <w:t>LUMBARRightGS</w:t>
             </w:r>
+            <w:proofErr w:type="spellEnd"/>
             <w:r>
               <w:rPr>
                 <w:rFonts w:eastAsia="Times New Roman"/>
@@ -6836,6 +7208,7 @@
               </w:rPr>
               <w:t>/</w:t>
             </w:r>
+            <w:proofErr w:type="gramEnd"/>
             <w:r>
               <w:rPr>
                 <w:rFonts w:eastAsia="Times New Roman"/>
@@ -6873,7 +7246,6 @@
                 <w:szCs w:val="24"/>
                 <w:shd w:val="clear" w:color="auto" w:fill="FFFFFF"/>
               </w:rPr>
-              <w:lastRenderedPageBreak/>
               <w:t>Left</w:t>
             </w:r>
           </w:p>
@@ -6893,6 +7265,7 @@
                 <w:shd w:val="clear" w:color="auto" w:fill="FFFFFF"/>
               </w:rPr>
             </w:pPr>
+            <w:proofErr w:type="gramStart"/>
             <w:r>
               <w:rPr>
                 <w:rFonts w:eastAsia="Times New Roman"/>
@@ -6904,6 +7277,7 @@
               </w:rPr>
               <w:t>{{</w:t>
             </w:r>
+            <w:proofErr w:type="spellStart"/>
             <w:r>
               <w:rPr>
                 <w:rFonts w:eastAsia="Times New Roman"/>
@@ -6916,6 +7290,7 @@
               </w:rPr>
               <w:t>LUMBARLEFTIliopsoas</w:t>
             </w:r>
+            <w:proofErr w:type="spellEnd"/>
             <w:r>
               <w:rPr>
                 <w:rFonts w:eastAsia="Times New Roman"/>
@@ -6935,7 +7310,18 @@
                 <w:szCs w:val="24"/>
                 <w:shd w:val="clear" w:color="auto" w:fill="FFFFFF"/>
               </w:rPr>
-              <w:t>/5</w:t>
+              <w:t>/</w:t>
+            </w:r>
+            <w:proofErr w:type="gramEnd"/>
+            <w:r>
+              <w:rPr>
+                <w:rFonts w:eastAsia="Times New Roman"/>
+                <w:color w:val="000000" w:themeColor="text1"/>
+                <w:sz w:val="24"/>
+                <w:szCs w:val="24"/>
+                <w:shd w:val="clear" w:color="auto" w:fill="FFFFFF"/>
+              </w:rPr>
+              <w:t>5</w:t>
             </w:r>
           </w:p>
         </w:tc>
@@ -6965,6 +7351,7 @@
               </w:rPr>
               <w:t>{{</w:t>
             </w:r>
+            <w:proofErr w:type="spellStart"/>
             <w:r>
               <w:rPr>
                 <w:rFonts w:eastAsia="Times New Roman"/>
@@ -6977,6 +7364,7 @@
               </w:rPr>
               <w:t>LUMBARLEFTQuadriceps</w:t>
             </w:r>
+            <w:proofErr w:type="spellEnd"/>
             <w:r>
               <w:rPr>
                 <w:rFonts w:eastAsia="Times New Roman"/>
@@ -7015,6 +7403,7 @@
                 <w:shd w:val="clear" w:color="auto" w:fill="FFFFFF"/>
               </w:rPr>
             </w:pPr>
+            <w:proofErr w:type="gramStart"/>
             <w:r>
               <w:rPr>
                 <w:rFonts w:eastAsia="Times New Roman"/>
@@ -7026,6 +7415,7 @@
               </w:rPr>
               <w:t>{{</w:t>
             </w:r>
+            <w:proofErr w:type="spellStart"/>
             <w:r>
               <w:rPr>
                 <w:rFonts w:eastAsia="Times New Roman"/>
@@ -7038,6 +7428,7 @@
               </w:rPr>
               <w:t>LUMBARLEFTHamstrings</w:t>
             </w:r>
+            <w:proofErr w:type="spellEnd"/>
             <w:r>
               <w:rPr>
                 <w:rFonts w:eastAsia="Times New Roman"/>
@@ -7057,7 +7448,18 @@
                 <w:szCs w:val="24"/>
                 <w:shd w:val="clear" w:color="auto" w:fill="FFFFFF"/>
               </w:rPr>
-              <w:t>/5</w:t>
+              <w:t>/</w:t>
+            </w:r>
+            <w:proofErr w:type="gramEnd"/>
+            <w:r>
+              <w:rPr>
+                <w:rFonts w:eastAsia="Times New Roman"/>
+                <w:color w:val="000000" w:themeColor="text1"/>
+                <w:sz w:val="24"/>
+                <w:szCs w:val="24"/>
+                <w:shd w:val="clear" w:color="auto" w:fill="FFFFFF"/>
+              </w:rPr>
+              <w:t>5</w:t>
             </w:r>
           </w:p>
         </w:tc>
@@ -7076,6 +7478,7 @@
                 <w:shd w:val="clear" w:color="auto" w:fill="FFFFFF"/>
               </w:rPr>
             </w:pPr>
+            <w:proofErr w:type="gramStart"/>
             <w:r>
               <w:rPr>
                 <w:rFonts w:eastAsia="Times New Roman"/>
@@ -7087,6 +7490,7 @@
               </w:rPr>
               <w:t>{{</w:t>
             </w:r>
+            <w:proofErr w:type="spellStart"/>
             <w:r>
               <w:rPr>
                 <w:rFonts w:eastAsia="Times New Roman"/>
@@ -7099,6 +7503,7 @@
               </w:rPr>
               <w:t>LUMBARLEFTTibant</w:t>
             </w:r>
+            <w:proofErr w:type="spellEnd"/>
             <w:r>
               <w:rPr>
                 <w:rFonts w:eastAsia="Times New Roman"/>
@@ -7118,7 +7523,18 @@
                 <w:szCs w:val="24"/>
                 <w:shd w:val="clear" w:color="auto" w:fill="FFFFFF"/>
               </w:rPr>
-              <w:t>/5</w:t>
+              <w:t>/</w:t>
+            </w:r>
+            <w:proofErr w:type="gramEnd"/>
+            <w:r>
+              <w:rPr>
+                <w:rFonts w:eastAsia="Times New Roman"/>
+                <w:color w:val="000000" w:themeColor="text1"/>
+                <w:sz w:val="24"/>
+                <w:szCs w:val="24"/>
+                <w:shd w:val="clear" w:color="auto" w:fill="FFFFFF"/>
+              </w:rPr>
+              <w:t>5</w:t>
             </w:r>
           </w:p>
         </w:tc>
@@ -7137,6 +7553,7 @@
                 <w:shd w:val="clear" w:color="auto" w:fill="FFFFFF"/>
               </w:rPr>
             </w:pPr>
+            <w:proofErr w:type="gramStart"/>
             <w:r>
               <w:rPr>
                 <w:rFonts w:eastAsia="Times New Roman"/>
@@ -7179,7 +7596,18 @@
                 <w:szCs w:val="24"/>
                 <w:shd w:val="clear" w:color="auto" w:fill="FFFFFF"/>
               </w:rPr>
-              <w:t>/5</w:t>
+              <w:t>/</w:t>
+            </w:r>
+            <w:proofErr w:type="gramEnd"/>
+            <w:r>
+              <w:rPr>
+                <w:rFonts w:eastAsia="Times New Roman"/>
+                <w:color w:val="000000" w:themeColor="text1"/>
+                <w:sz w:val="24"/>
+                <w:szCs w:val="24"/>
+                <w:shd w:val="clear" w:color="auto" w:fill="FFFFFF"/>
+              </w:rPr>
+              <w:t>5</w:t>
             </w:r>
           </w:p>
         </w:tc>
@@ -7198,6 +7626,7 @@
                 <w:shd w:val="clear" w:color="auto" w:fill="FFFFFF"/>
               </w:rPr>
             </w:pPr>
+            <w:proofErr w:type="gramStart"/>
             <w:r>
               <w:rPr>
                 <w:rFonts w:eastAsia="Times New Roman"/>
@@ -7240,7 +7669,18 @@
                 <w:szCs w:val="24"/>
                 <w:shd w:val="clear" w:color="auto" w:fill="FFFFFF"/>
               </w:rPr>
-              <w:t>/5</w:t>
+              <w:t>/</w:t>
+            </w:r>
+            <w:proofErr w:type="gramEnd"/>
+            <w:r>
+              <w:rPr>
+                <w:rFonts w:eastAsia="Times New Roman"/>
+                <w:color w:val="000000" w:themeColor="text1"/>
+                <w:sz w:val="24"/>
+                <w:szCs w:val="24"/>
+                <w:shd w:val="clear" w:color="auto" w:fill="FFFFFF"/>
+              </w:rPr>
+              <w:t>5</w:t>
             </w:r>
           </w:p>
         </w:tc>
@@ -8350,6 +8790,7 @@
                 <w:shd w:val="clear" w:color="auto" w:fill="FFFFFF"/>
               </w:rPr>
             </w:pPr>
+            <w:proofErr w:type="gramStart"/>
             <w:r>
               <w:rPr>
                 <w:rFonts w:eastAsia="Times New Roman" w:cstheme="minorHAnsi"/>
@@ -8361,6 +8802,7 @@
               </w:rPr>
               <w:t>{{</w:t>
             </w:r>
+            <w:proofErr w:type="spellStart"/>
             <w:r>
               <w:rPr>
                 <w:rFonts w:eastAsia="Times New Roman" w:cstheme="minorHAnsi"/>
@@ -8373,6 +8815,7 @@
               </w:rPr>
               <w:t>LUMBARPatellartendonright</w:t>
             </w:r>
+            <w:proofErr w:type="spellEnd"/>
             <w:r>
               <w:rPr>
                 <w:rFonts w:eastAsia="Times New Roman" w:cstheme="minorHAnsi"/>
@@ -8395,6 +8838,7 @@
               </w:rPr>
               <w:t>/</w:t>
             </w:r>
+            <w:proofErr w:type="gramEnd"/>
             <w:r>
               <w:rPr>
                 <w:rFonts w:eastAsia="Times New Roman" w:cstheme="minorHAnsi"/>
@@ -8422,6 +8866,7 @@
                 <w:shd w:val="clear" w:color="auto" w:fill="FFFFFF"/>
               </w:rPr>
             </w:pPr>
+            <w:proofErr w:type="gramStart"/>
             <w:r>
               <w:rPr>
                 <w:rFonts w:eastAsia="Times New Roman" w:cstheme="minorHAnsi"/>
@@ -8433,6 +8878,7 @@
               </w:rPr>
               <w:t>{{</w:t>
             </w:r>
+            <w:proofErr w:type="spellStart"/>
             <w:r>
               <w:rPr>
                 <w:rFonts w:eastAsia="Times New Roman" w:cstheme="minorHAnsi"/>
@@ -8445,6 +8891,7 @@
               </w:rPr>
               <w:t>LUMBARPatellartendonleft</w:t>
             </w:r>
+            <w:proofErr w:type="spellEnd"/>
             <w:r>
               <w:rPr>
                 <w:rFonts w:eastAsia="Times New Roman" w:cstheme="minorHAnsi"/>
@@ -8467,6 +8914,7 @@
               </w:rPr>
               <w:t>/</w:t>
             </w:r>
+            <w:proofErr w:type="gramEnd"/>
             <w:r>
               <w:rPr>
                 <w:rFonts w:eastAsia="Times New Roman" w:cstheme="minorHAnsi"/>
@@ -8523,6 +8971,7 @@
                 <w:shd w:val="clear" w:color="auto" w:fill="FFFFFF"/>
               </w:rPr>
             </w:pPr>
+            <w:proofErr w:type="gramStart"/>
             <w:r>
               <w:rPr>
                 <w:rFonts w:eastAsia="Times New Roman" w:cstheme="minorHAnsi"/>
@@ -8534,6 +8983,7 @@
               </w:rPr>
               <w:t>{{</w:t>
             </w:r>
+            <w:proofErr w:type="spellStart"/>
             <w:r>
               <w:rPr>
                 <w:rFonts w:eastAsia="Times New Roman" w:cstheme="minorHAnsi"/>
@@ -8546,6 +8996,7 @@
               </w:rPr>
               <w:t>LUMBARAchillestendonright</w:t>
             </w:r>
+            <w:proofErr w:type="spellEnd"/>
             <w:r>
               <w:rPr>
                 <w:rFonts w:eastAsia="Times New Roman" w:cstheme="minorHAnsi"/>
@@ -8568,6 +9019,7 @@
               </w:rPr>
               <w:t>/</w:t>
             </w:r>
+            <w:proofErr w:type="gramEnd"/>
             <w:r>
               <w:rPr>
                 <w:rFonts w:eastAsia="Times New Roman" w:cstheme="minorHAnsi"/>
@@ -8595,6 +9047,7 @@
                 <w:shd w:val="clear" w:color="auto" w:fill="FFFFFF"/>
               </w:rPr>
             </w:pPr>
+            <w:proofErr w:type="gramStart"/>
             <w:r>
               <w:rPr>
                 <w:rFonts w:eastAsia="Times New Roman" w:cstheme="minorHAnsi"/>
@@ -8606,6 +9059,7 @@
               </w:rPr>
               <w:t>{{</w:t>
             </w:r>
+            <w:proofErr w:type="spellStart"/>
             <w:r>
               <w:rPr>
                 <w:rFonts w:eastAsia="Times New Roman" w:cstheme="minorHAnsi"/>
@@ -8618,6 +9072,7 @@
               </w:rPr>
               <w:t>LUMBARAchillestendonleft</w:t>
             </w:r>
+            <w:proofErr w:type="spellEnd"/>
             <w:r>
               <w:rPr>
                 <w:rFonts w:eastAsia="Times New Roman" w:cstheme="minorHAnsi"/>
@@ -8637,7 +9092,18 @@
                 <w:szCs w:val="24"/>
                 <w:shd w:val="clear" w:color="auto" w:fill="FFFFFF"/>
               </w:rPr>
-              <w:t>/4</w:t>
+              <w:t>/</w:t>
+            </w:r>
+            <w:proofErr w:type="gramEnd"/>
+            <w:r>
+              <w:rPr>
+                <w:rFonts w:eastAsia="Times New Roman" w:cstheme="minorHAnsi"/>
+                <w:color w:val="000000" w:themeColor="text1"/>
+                <w:sz w:val="24"/>
+                <w:szCs w:val="24"/>
+                <w:shd w:val="clear" w:color="auto" w:fill="FFFFFF"/>
+              </w:rPr>
+              <w:t>4</w:t>
             </w:r>
           </w:p>
         </w:tc>
@@ -8702,7 +9168,16 @@
           <w:sz w:val="24"/>
           <w:szCs w:val="24"/>
         </w:rPr>
-        <w:t xml:space="preserve">has a </w:t>
+        <w:t xml:space="preserve">has </w:t>
+      </w:r>
+      <w:proofErr w:type="gramStart"/>
+      <w:r>
+        <w:rPr>
+          <w:rFonts w:ascii="Times New Roman" w:hAnsi="Times New Roman" w:cs="Times New Roman"/>
+          <w:sz w:val="24"/>
+          <w:szCs w:val="24"/>
+        </w:rPr>
+        <w:t xml:space="preserve">a </w:t>
       </w:r>
       <w:bookmarkStart w:id="1" w:name="_Hlk130881157"/>
       <w:r>
@@ -8711,7 +9186,16 @@
           <w:sz w:val="24"/>
           <w:szCs w:val="24"/>
         </w:rPr>
-        <w:t>______</w:t>
+        <w:t>__</w:t>
+      </w:r>
+      <w:proofErr w:type="gramEnd"/>
+      <w:r>
+        <w:rPr>
+          <w:rFonts w:ascii="Times New Roman" w:hAnsi="Times New Roman" w:cs="Times New Roman"/>
+          <w:sz w:val="24"/>
+          <w:szCs w:val="24"/>
+        </w:rPr>
+        <w:t>____</w:t>
       </w:r>
       <w:r>
         <w:rPr>
@@ -8824,7 +9308,29 @@
           <w:sz w:val="24"/>
           <w:szCs w:val="24"/>
         </w:rPr>
-        <w:t>MRI of the Cervical Spine mm/dd/yyyy:</w:t>
+        <w:t>MRI of the Cervical Spine mm/dd/</w:t>
+      </w:r>
+      <w:proofErr w:type="spellStart"/>
+      <w:r>
+        <w:rPr>
+          <w:rFonts w:ascii="Times New Roman" w:hAnsi="Times New Roman" w:cs="Times New Roman"/>
+          <w:b/>
+          <w:bCs/>
+          <w:sz w:val="24"/>
+          <w:szCs w:val="24"/>
+        </w:rPr>
+        <w:t>yyyy</w:t>
+      </w:r>
+      <w:proofErr w:type="spellEnd"/>
+      <w:r>
+        <w:rPr>
+          <w:rFonts w:ascii="Times New Roman" w:hAnsi="Times New Roman" w:cs="Times New Roman"/>
+          <w:b/>
+          <w:bCs/>
+          <w:sz w:val="24"/>
+          <w:szCs w:val="24"/>
+        </w:rPr>
+        <w:t>:</w:t>
       </w:r>
     </w:p>
     <w:p>
@@ -8911,7 +9417,29 @@
           <w:sz w:val="24"/>
           <w:szCs w:val="24"/>
         </w:rPr>
-        <w:t>Spine mm/dd/yyyy:</w:t>
+        <w:t>Spine mm/dd/</w:t>
+      </w:r>
+      <w:proofErr w:type="spellStart"/>
+      <w:r>
+        <w:rPr>
+          <w:rFonts w:ascii="Times New Roman" w:hAnsi="Times New Roman" w:cs="Times New Roman"/>
+          <w:b/>
+          <w:bCs/>
+          <w:sz w:val="24"/>
+          <w:szCs w:val="24"/>
+        </w:rPr>
+        <w:t>yyyy</w:t>
+      </w:r>
+      <w:proofErr w:type="spellEnd"/>
+      <w:r>
+        <w:rPr>
+          <w:rFonts w:ascii="Times New Roman" w:hAnsi="Times New Roman" w:cs="Times New Roman"/>
+          <w:b/>
+          <w:bCs/>
+          <w:sz w:val="24"/>
+          <w:szCs w:val="24"/>
+        </w:rPr>
+        <w:t>:</w:t>
       </w:r>
     </w:p>
     <w:p>
@@ -8968,7 +9496,29 @@
           <w:sz w:val="24"/>
           <w:szCs w:val="24"/>
         </w:rPr>
-        <w:t xml:space="preserve"> on mm/dd/yyyy:</w:t>
+        <w:t xml:space="preserve"> on mm/dd/</w:t>
+      </w:r>
+      <w:proofErr w:type="spellStart"/>
+      <w:r>
+        <w:rPr>
+          <w:rFonts w:ascii="Times New Roman" w:hAnsi="Times New Roman" w:cs="Times New Roman"/>
+          <w:b/>
+          <w:bCs/>
+          <w:sz w:val="24"/>
+          <w:szCs w:val="24"/>
+        </w:rPr>
+        <w:t>yyyy</w:t>
+      </w:r>
+      <w:proofErr w:type="spellEnd"/>
+      <w:r>
+        <w:rPr>
+          <w:rFonts w:ascii="Times New Roman" w:hAnsi="Times New Roman" w:cs="Times New Roman"/>
+          <w:b/>
+          <w:bCs/>
+          <w:sz w:val="24"/>
+          <w:szCs w:val="24"/>
+        </w:rPr>
+        <w:t>:</w:t>
       </w:r>
     </w:p>
     <w:p>
@@ -9049,7 +9599,29 @@
           <w:sz w:val="24"/>
           <w:szCs w:val="24"/>
         </w:rPr>
-        <w:t xml:space="preserve"> on mm/dd/yyyy:</w:t>
+        <w:t xml:space="preserve"> on mm/dd/</w:t>
+      </w:r>
+      <w:proofErr w:type="spellStart"/>
+      <w:r>
+        <w:rPr>
+          <w:rFonts w:ascii="Times New Roman" w:hAnsi="Times New Roman" w:cs="Times New Roman"/>
+          <w:b/>
+          <w:bCs/>
+          <w:sz w:val="24"/>
+          <w:szCs w:val="24"/>
+        </w:rPr>
+        <w:t>yyyy</w:t>
+      </w:r>
+      <w:proofErr w:type="spellEnd"/>
+      <w:r>
+        <w:rPr>
+          <w:rFonts w:ascii="Times New Roman" w:hAnsi="Times New Roman" w:cs="Times New Roman"/>
+          <w:b/>
+          <w:bCs/>
+          <w:sz w:val="24"/>
+          <w:szCs w:val="24"/>
+        </w:rPr>
+        <w:t>:</w:t>
       </w:r>
     </w:p>
     <w:p>
@@ -9292,7 +9864,27 @@
           <w:sz w:val="24"/>
           <w:szCs w:val="24"/>
         </w:rPr>
-        <w:t xml:space="preserve">To maximize conservative care, the patient is recommended to _____start/continue physical therapy/chiropractic care/acupuncture/home exercise program. </w:t>
+        <w:t xml:space="preserve">To maximize conservative care, the patient is recommended </w:t>
+      </w:r>
+      <w:proofErr w:type="gramStart"/>
+      <w:r>
+        <w:rPr>
+          <w:rFonts w:ascii="Times New Roman" w:hAnsi="Times New Roman"/>
+          <w:color w:val="000000"/>
+          <w:sz w:val="24"/>
+          <w:szCs w:val="24"/>
+        </w:rPr>
+        <w:t>to __</w:t>
+      </w:r>
+      <w:proofErr w:type="gramEnd"/>
+      <w:r>
+        <w:rPr>
+          <w:rFonts w:ascii="Times New Roman" w:hAnsi="Times New Roman"/>
+          <w:color w:val="000000"/>
+          <w:sz w:val="24"/>
+          <w:szCs w:val="24"/>
+        </w:rPr>
+        <w:t xml:space="preserve">___start/continue physical therapy/chiropractic care/acupuncture/home exercise program. </w:t>
       </w:r>
     </w:p>
     <w:p>
@@ -9322,7 +9914,6 @@
           <w:szCs w:val="24"/>
           <w:u w:val="single"/>
         </w:rPr>
-        <w:lastRenderedPageBreak/>
         <w:t>Medical Necessity for Physical Therapy:</w:t>
       </w:r>
     </w:p>
@@ -9351,6 +9942,7 @@
           <w:sz w:val="24"/>
           <w:szCs w:val="24"/>
         </w:rPr>
+        <w:lastRenderedPageBreak/>
         <w:t>Physical therapy is needed to maximize conservative therapy to decrease pain and improve function. It will involve the use of physical modalities, joint mobilization, and instruction for therapeutic and postural exercises.</w:t>
       </w:r>
     </w:p>
@@ -9461,7 +10053,31 @@
           <w:sz w:val="24"/>
           <w:szCs w:val="24"/>
         </w:rPr>
-        <w:t>Recommended MRI / CT scan / x-ray of _____ cervical spine/lumbar spine.</w:t>
+        <w:t xml:space="preserve">Recommended MRI / CT scan / x-ray </w:t>
+      </w:r>
+      <w:proofErr w:type="gramStart"/>
+      <w:r>
+        <w:rPr>
+          <w:rFonts w:ascii="Times New Roman" w:eastAsia="Times New Roman" w:hAnsi="Times New Roman"/>
+          <w:bCs/>
+          <w:color w:val="000000"/>
+          <w:spacing w:val="4"/>
+          <w:sz w:val="24"/>
+          <w:szCs w:val="24"/>
+        </w:rPr>
+        <w:t>of __</w:t>
+      </w:r>
+      <w:proofErr w:type="gramEnd"/>
+      <w:r>
+        <w:rPr>
+          <w:rFonts w:ascii="Times New Roman" w:eastAsia="Times New Roman" w:hAnsi="Times New Roman"/>
+          <w:bCs/>
+          <w:color w:val="000000"/>
+          <w:spacing w:val="4"/>
+          <w:sz w:val="24"/>
+          <w:szCs w:val="24"/>
+        </w:rPr>
+        <w:t>___ cervical spine/lumbar spine.</w:t>
       </w:r>
     </w:p>
     <w:p>
@@ -9491,8 +10107,9 @@
           <w:sz w:val="24"/>
           <w:szCs w:val="24"/>
         </w:rPr>
-        <w:t xml:space="preserve">EMG and NCV of _____ upper/lower extremities ____done today / </w:t>
-      </w:r>
+        <w:t xml:space="preserve">EMG and NCV </w:t>
+      </w:r>
+      <w:proofErr w:type="gramStart"/>
       <w:r>
         <w:rPr>
           <w:rFonts w:ascii="Times New Roman" w:eastAsia="Times New Roman" w:hAnsi="Times New Roman"/>
@@ -9502,8 +10119,9 @@
           <w:sz w:val="24"/>
           <w:szCs w:val="24"/>
         </w:rPr>
-        <w:t>to be performed next visit</w:t>
-      </w:r>
+        <w:t>of __</w:t>
+      </w:r>
+      <w:proofErr w:type="gramEnd"/>
       <w:r>
         <w:rPr>
           <w:rFonts w:ascii="Times New Roman" w:eastAsia="Times New Roman" w:hAnsi="Times New Roman"/>
@@ -9513,14 +10131,9 @@
           <w:sz w:val="24"/>
           <w:szCs w:val="24"/>
         </w:rPr>
-        <w:t xml:space="preserve"> to evaluate numbness and tingling and to rule out _____cervical/lumbar radiculopathy. </w:t>
-      </w:r>
-    </w:p>
-    <w:p>
-      <w:pPr>
-        <w:spacing w:after="0" w:line="240" w:lineRule="auto"/>
-        <w:ind w:left="1440"/>
-        <w:textAlignment w:val="baseline"/>
+        <w:t xml:space="preserve">___ upper/lower extremities ____done today / </w:t>
+      </w:r>
+      <w:r>
         <w:rPr>
           <w:rFonts w:ascii="Times New Roman" w:eastAsia="Times New Roman" w:hAnsi="Times New Roman"/>
           <w:bCs/>
@@ -9528,9 +10141,9 @@
           <w:spacing w:val="4"/>
           <w:sz w:val="24"/>
           <w:szCs w:val="24"/>
-          <w:u w:val="single"/>
-        </w:rPr>
-      </w:pPr>
+        </w:rPr>
+        <w:t>to be performed next visit</w:t>
+      </w:r>
       <w:r>
         <w:rPr>
           <w:rFonts w:ascii="Times New Roman" w:eastAsia="Times New Roman" w:hAnsi="Times New Roman"/>
@@ -9539,9 +10152,8 @@
           <w:spacing w:val="4"/>
           <w:sz w:val="24"/>
           <w:szCs w:val="24"/>
-          <w:u w:val="single"/>
-        </w:rPr>
-        <w:t>Medical necessity for EMG/NCV Test:</w:t>
+        </w:rPr>
+        <w:t xml:space="preserve"> to evaluate numbness and tingling and to rule out _____cervical/lumbar radiculopathy. </w:t>
       </w:r>
     </w:p>
     <w:p>
@@ -9556,6 +10168,7 @@
           <w:spacing w:val="4"/>
           <w:sz w:val="24"/>
           <w:szCs w:val="24"/>
+          <w:u w:val="single"/>
         </w:rPr>
       </w:pPr>
       <w:r>
@@ -9566,10 +10179,16 @@
           <w:spacing w:val="4"/>
           <w:sz w:val="24"/>
           <w:szCs w:val="24"/>
-        </w:rPr>
-        <w:t xml:space="preserve">As a result of the history and physical findings, needle electrodiagnostic studies are indicated in this patient at this time. Specifically, the patient exhibits the following differential diagnosis: rule out radiculopathy at the level of the nerve root exit from the spinal canal versus more peripheral nerve entrapment. Needle EMG is essential in the treatment of this patient in order to establish the exact nature of the injury or disease process. Needle EMG is essential to alter and establish a modified treatment plan, more focused on its nature and content, and to offer the patient an accurate prognosis. The treatment plan may include medications, injections, nerve blocks and/or surgical intervention as well as continuation of conservative therapy. Also, the patient will be scheduled for the NCV study because the patient exhibits the following differential diagnosis: peripheral nerve entrapment at the level of the spinal nerve exit from the vertebral foramen, the proximal brachial or lumbar plexus, involvement in the proximal limb by direct trauma or excessive muscle contraction, or distal nerve compression in the limb. Nerve conduction studies are essential in the treatment of this patient in order to establish the exact nature of the injury or disease process. Nerve conduction studies are essential to alter and establish a modified treatment plan, more focused in its nature content, and to offer the patient an accurate prognosis. The treatment plan may include medications, injections, nerve blocks and/or surgical intervention as well as continuation of conservative therapy. Such treatment cannot be justified with certainty and high medical probability in the absence of nerve conduction studies. Nerve conduction velocity (NCV) and H-reflex study can be used to evaluate neuropathies and/or signs of atrophy. Neurapraxia, axonotmesis, polyphasic motor units, fibrillations, and insertional activity can be established only by electrophysiological testing and not by physical examination or radiological imaging. The presence and severity of these indicators of nerve damage is used to determine whether healing is taking place and at what rate, whether conservative care will be beneficial if continued or whether interventional treatment may lead to more rapid relief of symptoms and return to normal motor function. They are also used to determine a specific neurological root level to focus conservative or interventional treatment as these electrophysiological tests can differ in level or severity from the anatomic findings of MRI, especially in persons with mild </w:t>
-      </w:r>
-      <w:r>
+          <w:u w:val="single"/>
+        </w:rPr>
+        <w:t>Medical necessity for EMG/NCV Test:</w:t>
+      </w:r>
+    </w:p>
+    <w:p>
+      <w:pPr>
+        <w:spacing w:after="0" w:line="240" w:lineRule="auto"/>
+        <w:ind w:left="1440"/>
+        <w:textAlignment w:val="baseline"/>
         <w:rPr>
           <w:rFonts w:ascii="Times New Roman" w:eastAsia="Times New Roman" w:hAnsi="Times New Roman"/>
           <w:bCs/>
@@ -9578,8 +10197,101 @@
           <w:sz w:val="24"/>
           <w:szCs w:val="24"/>
         </w:rPr>
+      </w:pPr>
+      <w:r>
+        <w:rPr>
+          <w:rFonts w:ascii="Times New Roman" w:eastAsia="Times New Roman" w:hAnsi="Times New Roman"/>
+          <w:bCs/>
+          <w:color w:val="000000"/>
+          <w:spacing w:val="4"/>
+          <w:sz w:val="24"/>
+          <w:szCs w:val="24"/>
+        </w:rPr>
+        <w:t xml:space="preserve">As a result of the history and physical findings, needle electrodiagnostic studies are indicated in this patient </w:t>
+      </w:r>
+      <w:proofErr w:type="gramStart"/>
+      <w:r>
+        <w:rPr>
+          <w:rFonts w:ascii="Times New Roman" w:eastAsia="Times New Roman" w:hAnsi="Times New Roman"/>
+          <w:bCs/>
+          <w:color w:val="000000"/>
+          <w:spacing w:val="4"/>
+          <w:sz w:val="24"/>
+          <w:szCs w:val="24"/>
+        </w:rPr>
+        <w:t>at this time</w:t>
+      </w:r>
+      <w:proofErr w:type="gramEnd"/>
+      <w:r>
+        <w:rPr>
+          <w:rFonts w:ascii="Times New Roman" w:eastAsia="Times New Roman" w:hAnsi="Times New Roman"/>
+          <w:bCs/>
+          <w:color w:val="000000"/>
+          <w:spacing w:val="4"/>
+          <w:sz w:val="24"/>
+          <w:szCs w:val="24"/>
+        </w:rPr>
+        <w:t xml:space="preserve">. Specifically, the patient exhibits the following differential diagnosis: rule out radiculopathy at the level of the nerve root exit from the spinal canal versus more peripheral nerve entrapment. Needle EMG is essential in the treatment of this patient </w:t>
+      </w:r>
+      <w:proofErr w:type="gramStart"/>
+      <w:r>
+        <w:rPr>
+          <w:rFonts w:ascii="Times New Roman" w:eastAsia="Times New Roman" w:hAnsi="Times New Roman"/>
+          <w:bCs/>
+          <w:color w:val="000000"/>
+          <w:spacing w:val="4"/>
+          <w:sz w:val="24"/>
+          <w:szCs w:val="24"/>
+        </w:rPr>
+        <w:t>in order to</w:t>
+      </w:r>
+      <w:proofErr w:type="gramEnd"/>
+      <w:r>
+        <w:rPr>
+          <w:rFonts w:ascii="Times New Roman" w:eastAsia="Times New Roman" w:hAnsi="Times New Roman"/>
+          <w:bCs/>
+          <w:color w:val="000000"/>
+          <w:spacing w:val="4"/>
+          <w:sz w:val="24"/>
+          <w:szCs w:val="24"/>
+        </w:rPr>
+        <w:t xml:space="preserve"> establish the exact nature of the injury or disease process. Needle EMG is essential to alter and establish a modified treatment plan, more focused on its nature and content, and to offer the patient an accurate prognosis. The treatment plan may include medications, injections, nerve blocks and/or surgical intervention as well as continuation of conservative therapy. Also, the patient will be scheduled for the NCV study because the patient exhibits the following differential diagnosis: peripheral nerve entrapment at the level of the spinal nerve exit from the vertebral foramen, the proximal brachial or lumbar plexus, involvement in the proximal limb by direct trauma or excessive muscle contraction, or distal nerve compression in the limb. Nerve conduction studies are essential in the treatment of this patient </w:t>
+      </w:r>
+      <w:proofErr w:type="gramStart"/>
+      <w:r>
+        <w:rPr>
+          <w:rFonts w:ascii="Times New Roman" w:eastAsia="Times New Roman" w:hAnsi="Times New Roman"/>
+          <w:bCs/>
+          <w:color w:val="000000"/>
+          <w:spacing w:val="4"/>
+          <w:sz w:val="24"/>
+          <w:szCs w:val="24"/>
+        </w:rPr>
+        <w:t>in order to</w:t>
+      </w:r>
+      <w:proofErr w:type="gramEnd"/>
+      <w:r>
+        <w:rPr>
+          <w:rFonts w:ascii="Times New Roman" w:eastAsia="Times New Roman" w:hAnsi="Times New Roman"/>
+          <w:bCs/>
+          <w:color w:val="000000"/>
+          <w:spacing w:val="4"/>
+          <w:sz w:val="24"/>
+          <w:szCs w:val="24"/>
+        </w:rPr>
+        <w:t xml:space="preserve"> establish the exact nature of the injury or disease process. Nerve conduction studies are essential to alter and establish a modified treatment plan, more focused in its nature content, and to offer the patient an accurate prognosis. The treatment plan may include medications, injections, nerve blocks and/or surgical intervention as well as continuation of conservative therapy. Such treatment cannot be justified with certainty and high medical probability in the absence of nerve conduction studies. Nerve conduction velocity (NCV) and H-reflex study can be used to evaluate neuropathies and/or signs of atrophy. Neurapraxia, axonotmesis, polyphasic motor units, fibrillations, and insertional activity can be established only by electrophysiological testing and not by physical examination or radiological imaging. The presence and severity of these indicators of nerve damage is used to determine whether healing is taking place and at what rate, whether conservative care will be beneficial if continued or whether interventional treatment may lead to more rapid relief of symptoms and return to normal motor function. They are also used to determine a specific neurological root level to focus conservative or interventional treatment as these electrophysiological tests can differ in level or severity from the anatomic findings of MRI, especially in persons with mild to moderate radiculopathy. 70% of people with abnormal MRI have EMG </w:t>
+      </w:r>
+      <w:r>
+        <w:rPr>
+          <w:rFonts w:ascii="Times New Roman" w:eastAsia="Times New Roman" w:hAnsi="Times New Roman"/>
+          <w:bCs/>
+          <w:color w:val="000000"/>
+          <w:spacing w:val="4"/>
+          <w:sz w:val="24"/>
+          <w:szCs w:val="24"/>
+        </w:rPr>
         <w:lastRenderedPageBreak/>
-        <w:t>to moderate radiculopathy. 70% of people with abnormal MRI have EMG findings at a second neurological level or on the opposite side (RA Nardin, 1999). Detection of a peripheral lesion (most commonly carpal or tarsal tunnel or ulnar nerve at the elbow) will result in changing or addition of therapies if the peripheral lesion is primary rather than secondary to proximal nerve compression ("double crush syndrome"). Detection of neuroanatomic anomalies (especially median to ulnar (Martin Gruber) anastomosis which is found in over 20% of people) can identify persons whose nerve damage is more severe than indicated by symptoms or examination.</w:t>
+        <w:t>findings at a second neurological level or on the opposite side (RA Nardin, 1999). Detection of a peripheral lesion (most commonly carpal or tarsal tunnel or ulnar nerve at the elbow) will result in changing or addition of therapies if the peripheral lesion is primary rather than secondary to proximal nerve compression ("double crush syndrome"). Detection of neuroanatomic anomalies (especially median to ulnar (Martin Gruber) anastomosis which is found in over 20% of people) can identify persons whose nerve damage is more severe than indicated by symptoms or examination.</w:t>
       </w:r>
     </w:p>
     <w:p>
@@ -9609,7 +10321,31 @@
           <w:sz w:val="24"/>
           <w:szCs w:val="24"/>
         </w:rPr>
-        <w:t>To maximize the conservative care, the patient was given _____cervical/lumbar trigger point injection today. The procedure note and consent form signed are attached with the file.</w:t>
+        <w:t xml:space="preserve">To maximize the conservative care, the patient was given _____cervical/lumbar trigger point injection today. The procedure </w:t>
+      </w:r>
+      <w:proofErr w:type="gramStart"/>
+      <w:r>
+        <w:rPr>
+          <w:rFonts w:ascii="Times New Roman" w:eastAsia="Times New Roman" w:hAnsi="Times New Roman"/>
+          <w:bCs/>
+          <w:color w:val="000000"/>
+          <w:spacing w:val="4"/>
+          <w:sz w:val="24"/>
+          <w:szCs w:val="24"/>
+        </w:rPr>
+        <w:t>note</w:t>
+      </w:r>
+      <w:proofErr w:type="gramEnd"/>
+      <w:r>
+        <w:rPr>
+          <w:rFonts w:ascii="Times New Roman" w:eastAsia="Times New Roman" w:hAnsi="Times New Roman"/>
+          <w:bCs/>
+          <w:color w:val="000000"/>
+          <w:spacing w:val="4"/>
+          <w:sz w:val="24"/>
+          <w:szCs w:val="24"/>
+        </w:rPr>
+        <w:t xml:space="preserve"> and consent form signed are attached with the file.</w:t>
       </w:r>
     </w:p>
     <w:p>
@@ -9725,7 +10461,33 @@
           <w:szCs w:val="24"/>
           <w:u w:val="single"/>
         </w:rPr>
-        <w:t>Medical necessity for _____ Injection:</w:t>
+        <w:t xml:space="preserve">Medical necessity </w:t>
+      </w:r>
+      <w:proofErr w:type="gramStart"/>
+      <w:r>
+        <w:rPr>
+          <w:rFonts w:ascii="Times New Roman" w:eastAsia="Times New Roman" w:hAnsi="Times New Roman"/>
+          <w:bCs/>
+          <w:color w:val="000000"/>
+          <w:spacing w:val="4"/>
+          <w:sz w:val="24"/>
+          <w:szCs w:val="24"/>
+          <w:u w:val="single"/>
+        </w:rPr>
+        <w:t>for __</w:t>
+      </w:r>
+      <w:proofErr w:type="gramEnd"/>
+      <w:r>
+        <w:rPr>
+          <w:rFonts w:ascii="Times New Roman" w:eastAsia="Times New Roman" w:hAnsi="Times New Roman"/>
+          <w:bCs/>
+          <w:color w:val="000000"/>
+          <w:spacing w:val="4"/>
+          <w:sz w:val="24"/>
+          <w:szCs w:val="24"/>
+          <w:u w:val="single"/>
+        </w:rPr>
+        <w:t>___ Injection:</w:t>
       </w:r>
     </w:p>
     <w:p>
@@ -9770,7 +10532,27 @@
           <w:sz w:val="24"/>
           <w:szCs w:val="24"/>
         </w:rPr>
-        <w:t>Follow up in _____ weeks/months/as needed.</w:t>
+        <w:t xml:space="preserve">Follow up </w:t>
+      </w:r>
+      <w:proofErr w:type="gramStart"/>
+      <w:r>
+        <w:rPr>
+          <w:rFonts w:ascii="Times New Roman" w:hAnsi="Times New Roman"/>
+          <w:color w:val="000000"/>
+          <w:sz w:val="24"/>
+          <w:szCs w:val="24"/>
+        </w:rPr>
+        <w:t>in __</w:t>
+      </w:r>
+      <w:proofErr w:type="gramEnd"/>
+      <w:r>
+        <w:rPr>
+          <w:rFonts w:ascii="Times New Roman" w:hAnsi="Times New Roman"/>
+          <w:color w:val="000000"/>
+          <w:sz w:val="24"/>
+          <w:szCs w:val="24"/>
+        </w:rPr>
+        <w:t>___ weeks/months/as needed.</w:t>
       </w:r>
     </w:p>
     <w:p>
@@ -9879,7 +10661,97 @@
           <w:sz w:val="24"/>
           <w:szCs w:val="24"/>
         </w:rPr>
-        <w:t xml:space="preserve">After obtaining informed consent, the patient's muscles were palpated for the painful area of complaint. The painful area of the muscles was detected. Palpation over this taut band of muscle caused a twitch response and a referred pain pattern. At this time, the area was marked and sprayed with topical ethyl chloride. A combination 5 cc of 1% Lidocaine and 1cc of 10mg of dexa was drawn using a 21 gauge 1 inch needle. The skin was prepped and a 25 gauge needle replaced the 21 gauge needle, which was then introduced through the skin and subcutaneous tissues down into the taut band of muscle. After aspiration to make sure that the needle was not inside a vessel, a mixture of the following mixture was injected in the above trigger point regions. </w:t>
+        <w:t xml:space="preserve">After obtaining informed consent, the patient's muscles were palpated for the painful area of complaint. The painful area of the muscles was detected. Palpation over this taut band of muscle caused a twitch response and a referred pain pattern. At this time, the area was marked and sprayed with topical ethyl chloride. A </w:t>
+      </w:r>
+      <w:proofErr w:type="gramStart"/>
+      <w:r>
+        <w:rPr>
+          <w:rFonts w:ascii="Times New Roman" w:hAnsi="Times New Roman" w:cs="Times New Roman"/>
+          <w:sz w:val="24"/>
+          <w:szCs w:val="24"/>
+        </w:rPr>
+        <w:t>combination</w:t>
+      </w:r>
+      <w:proofErr w:type="gramEnd"/>
+      <w:r>
+        <w:rPr>
+          <w:rFonts w:ascii="Times New Roman" w:hAnsi="Times New Roman" w:cs="Times New Roman"/>
+          <w:sz w:val="24"/>
+          <w:szCs w:val="24"/>
+        </w:rPr>
+        <w:t xml:space="preserve"> 5 cc of 1% Lidocaine and 1cc of 10mg of </w:t>
+      </w:r>
+      <w:proofErr w:type="spellStart"/>
+      <w:r>
+        <w:rPr>
+          <w:rFonts w:ascii="Times New Roman" w:hAnsi="Times New Roman" w:cs="Times New Roman"/>
+          <w:sz w:val="24"/>
+          <w:szCs w:val="24"/>
+        </w:rPr>
+        <w:t>dexa</w:t>
+      </w:r>
+      <w:proofErr w:type="spellEnd"/>
+      <w:r>
+        <w:rPr>
+          <w:rFonts w:ascii="Times New Roman" w:hAnsi="Times New Roman" w:cs="Times New Roman"/>
+          <w:sz w:val="24"/>
+          <w:szCs w:val="24"/>
+        </w:rPr>
+        <w:t xml:space="preserve"> was drawn using a </w:t>
+      </w:r>
+      <w:proofErr w:type="gramStart"/>
+      <w:r>
+        <w:rPr>
+          <w:rFonts w:ascii="Times New Roman" w:hAnsi="Times New Roman" w:cs="Times New Roman"/>
+          <w:sz w:val="24"/>
+          <w:szCs w:val="24"/>
+        </w:rPr>
+        <w:t>21 gauge</w:t>
+      </w:r>
+      <w:proofErr w:type="gramEnd"/>
+      <w:r>
+        <w:rPr>
+          <w:rFonts w:ascii="Times New Roman" w:hAnsi="Times New Roman" w:cs="Times New Roman"/>
+          <w:sz w:val="24"/>
+          <w:szCs w:val="24"/>
+        </w:rPr>
+        <w:t xml:space="preserve"> 1 inch needle. The skin was prepped and a </w:t>
+      </w:r>
+      <w:proofErr w:type="gramStart"/>
+      <w:r>
+        <w:rPr>
+          <w:rFonts w:ascii="Times New Roman" w:hAnsi="Times New Roman" w:cs="Times New Roman"/>
+          <w:sz w:val="24"/>
+          <w:szCs w:val="24"/>
+        </w:rPr>
+        <w:t>25 gauge</w:t>
+      </w:r>
+      <w:proofErr w:type="gramEnd"/>
+      <w:r>
+        <w:rPr>
+          <w:rFonts w:ascii="Times New Roman" w:hAnsi="Times New Roman" w:cs="Times New Roman"/>
+          <w:sz w:val="24"/>
+          <w:szCs w:val="24"/>
+        </w:rPr>
+        <w:t xml:space="preserve"> needle replaced the </w:t>
+      </w:r>
+      <w:proofErr w:type="gramStart"/>
+      <w:r>
+        <w:rPr>
+          <w:rFonts w:ascii="Times New Roman" w:hAnsi="Times New Roman" w:cs="Times New Roman"/>
+          <w:sz w:val="24"/>
+          <w:szCs w:val="24"/>
+        </w:rPr>
+        <w:t>21 gauge</w:t>
+      </w:r>
+      <w:proofErr w:type="gramEnd"/>
+      <w:r>
+        <w:rPr>
+          <w:rFonts w:ascii="Times New Roman" w:hAnsi="Times New Roman" w:cs="Times New Roman"/>
+          <w:sz w:val="24"/>
+          <w:szCs w:val="24"/>
+        </w:rPr>
+        <w:t xml:space="preserve"> needle, which was then introduced through the skin and subcutaneous tissues down into the taut band of muscle. After aspiration to make sure that the needle was not inside a vessel, a mixture of the following mixture was injected in the above trigger point regions. </w:t>
       </w:r>
     </w:p>
     <w:p>
@@ -9901,20 +10773,21 @@
         </w:rPr>
       </w:pPr>
       <w:r>
-        <w:t>The mixture was injected after aspiration was negative for blood or air. The ultrasound machine was also used to visualize the medication going past the adipose tissue and into the muscles to avoid any vulnerable areas such arteries, veins, and nerves. After aspiration to make sure that the needle was not inside a vessel, a mixture of the medication was injected in the above trigger point regions. The patient tolerated the procedure well with no complication.</w:t>
+        <w:t xml:space="preserve">The mixture was injected after aspiration was negative for blood or air. The ultrasound machine was also used to visualize the medication going past the adipose tissue and into the muscles to avoid any vulnerable areas such arteries, veins, and nerves. After aspiration to make sure that the needle was not inside a vessel, a mixture of the medication was injected </w:t>
+      </w:r>
+      <w:proofErr w:type="gramStart"/>
+      <w:r>
+        <w:t>in</w:t>
+      </w:r>
+      <w:proofErr w:type="gramEnd"/>
+      <w:r>
+        <w:t xml:space="preserve"> the above trigger point regions. The patient tolerated the procedure well with no complication.</w:t>
       </w:r>
       <w:r>
         <w:rPr>
           <w:color w:val="000000"/>
         </w:rPr>
-        <w:t xml:space="preserve"> The patient was </w:t>
-      </w:r>
-      <w:r>
-        <w:rPr>
-          <w:color w:val="000000"/>
-        </w:rPr>
-        <w:lastRenderedPageBreak/>
-        <w:t>told of the possible side effects and was asked to call the office and speak to the physician on call if they had any questions.</w:t>
+        <w:t xml:space="preserve"> The patient was told of the possible side effects and was asked to call the office and speak to the physician on call if they had any questions.</w:t>
       </w:r>
     </w:p>
     <w:p>
@@ -9930,6 +10803,7 @@
           <w:color w:val="000000"/>
           <w:u w:val="single"/>
         </w:rPr>
+        <w:lastRenderedPageBreak/>
         <w:t xml:space="preserve">Ultrasonic guidance for needle placement, imaging supervision and interpretation: </w:t>
       </w:r>
       <w:r>
@@ -10118,7 +10992,97 @@
           <w:sz w:val="24"/>
           <w:szCs w:val="24"/>
         </w:rPr>
-        <w:t xml:space="preserve">After obtaining informed consent, the patient's muscles were palpated for the painful area of complaint. The painful area of the muscles was detected. Palpation over this taut band of muscle caused a twitch response and a referred pain pattern. At this time, the area was marked and sprayed with topical ethyl chloride. A combination 5 cc of 1% Lidocaine and 1cc of 10mg of dexa was drawn using a 21 gauge 1 inch needle. The skin was prepped and a 25 gauge needle replaced the 21 gauge needle, which was then introduced through the skin and subcutaneous tissues down into the taut band of muscle. After aspiration to make sure that the needle was not inside a vessel, a mixture of the following mixture was injected in the above trigger point regions. </w:t>
+        <w:t xml:space="preserve">After obtaining informed consent, the patient's muscles were palpated for the painful area of complaint. The painful area of the muscles was detected. Palpation over this taut band of muscle caused a twitch response and a referred pain pattern. At this time, the area was marked and sprayed with topical ethyl chloride. A </w:t>
+      </w:r>
+      <w:proofErr w:type="gramStart"/>
+      <w:r>
+        <w:rPr>
+          <w:rFonts w:ascii="Times New Roman" w:hAnsi="Times New Roman" w:cs="Times New Roman"/>
+          <w:sz w:val="24"/>
+          <w:szCs w:val="24"/>
+        </w:rPr>
+        <w:t>combination</w:t>
+      </w:r>
+      <w:proofErr w:type="gramEnd"/>
+      <w:r>
+        <w:rPr>
+          <w:rFonts w:ascii="Times New Roman" w:hAnsi="Times New Roman" w:cs="Times New Roman"/>
+          <w:sz w:val="24"/>
+          <w:szCs w:val="24"/>
+        </w:rPr>
+        <w:t xml:space="preserve"> 5 cc of 1% Lidocaine and 1cc of 10mg of </w:t>
+      </w:r>
+      <w:proofErr w:type="spellStart"/>
+      <w:r>
+        <w:rPr>
+          <w:rFonts w:ascii="Times New Roman" w:hAnsi="Times New Roman" w:cs="Times New Roman"/>
+          <w:sz w:val="24"/>
+          <w:szCs w:val="24"/>
+        </w:rPr>
+        <w:t>dexa</w:t>
+      </w:r>
+      <w:proofErr w:type="spellEnd"/>
+      <w:r>
+        <w:rPr>
+          <w:rFonts w:ascii="Times New Roman" w:hAnsi="Times New Roman" w:cs="Times New Roman"/>
+          <w:sz w:val="24"/>
+          <w:szCs w:val="24"/>
+        </w:rPr>
+        <w:t xml:space="preserve"> was drawn using a </w:t>
+      </w:r>
+      <w:proofErr w:type="gramStart"/>
+      <w:r>
+        <w:rPr>
+          <w:rFonts w:ascii="Times New Roman" w:hAnsi="Times New Roman" w:cs="Times New Roman"/>
+          <w:sz w:val="24"/>
+          <w:szCs w:val="24"/>
+        </w:rPr>
+        <w:t>21 gauge</w:t>
+      </w:r>
+      <w:proofErr w:type="gramEnd"/>
+      <w:r>
+        <w:rPr>
+          <w:rFonts w:ascii="Times New Roman" w:hAnsi="Times New Roman" w:cs="Times New Roman"/>
+          <w:sz w:val="24"/>
+          <w:szCs w:val="24"/>
+        </w:rPr>
+        <w:t xml:space="preserve"> 1 inch needle. The skin was prepped and a </w:t>
+      </w:r>
+      <w:proofErr w:type="gramStart"/>
+      <w:r>
+        <w:rPr>
+          <w:rFonts w:ascii="Times New Roman" w:hAnsi="Times New Roman" w:cs="Times New Roman"/>
+          <w:sz w:val="24"/>
+          <w:szCs w:val="24"/>
+        </w:rPr>
+        <w:t>25 gauge</w:t>
+      </w:r>
+      <w:proofErr w:type="gramEnd"/>
+      <w:r>
+        <w:rPr>
+          <w:rFonts w:ascii="Times New Roman" w:hAnsi="Times New Roman" w:cs="Times New Roman"/>
+          <w:sz w:val="24"/>
+          <w:szCs w:val="24"/>
+        </w:rPr>
+        <w:t xml:space="preserve"> needle replaced the </w:t>
+      </w:r>
+      <w:proofErr w:type="gramStart"/>
+      <w:r>
+        <w:rPr>
+          <w:rFonts w:ascii="Times New Roman" w:hAnsi="Times New Roman" w:cs="Times New Roman"/>
+          <w:sz w:val="24"/>
+          <w:szCs w:val="24"/>
+        </w:rPr>
+        <w:t>21 gauge</w:t>
+      </w:r>
+      <w:proofErr w:type="gramEnd"/>
+      <w:r>
+        <w:rPr>
+          <w:rFonts w:ascii="Times New Roman" w:hAnsi="Times New Roman" w:cs="Times New Roman"/>
+          <w:sz w:val="24"/>
+          <w:szCs w:val="24"/>
+        </w:rPr>
+        <w:t xml:space="preserve"> needle, which was then introduced through the skin and subcutaneous tissues down into the taut band of muscle. After aspiration to make sure that the needle was not inside a vessel, a mixture of the following mixture was injected in the above trigger point regions. </w:t>
       </w:r>
     </w:p>
     <w:p>
@@ -10140,7 +11104,15 @@
         </w:rPr>
       </w:pPr>
       <w:r>
-        <w:t>The mixture was injected after aspiration was negative for blood or air. The ultrasound machine was also used to visualize the medication going past the adipose tissue and into the muscles to avoid any vulnerable areas such arteries, veins, and nerves. After aspiration to make sure that the needle was not inside a vessel, a mixture of the medication was injected in the above trigger point regions. The patient tolerated the procedure well with no complication.</w:t>
+        <w:t xml:space="preserve">The mixture was injected after aspiration was negative for blood or air. The ultrasound machine was also used to visualize the medication going past the adipose tissue and into the muscles to avoid any vulnerable areas such arteries, veins, and nerves. After aspiration to make sure that the needle was not inside a vessel, a mixture of the medication was injected </w:t>
+      </w:r>
+      <w:proofErr w:type="gramStart"/>
+      <w:r>
+        <w:t>in</w:t>
+      </w:r>
+      <w:proofErr w:type="gramEnd"/>
+      <w:r>
+        <w:t xml:space="preserve"> the above trigger point regions. The patient tolerated the procedure well with no complication.</w:t>
       </w:r>
       <w:r>
         <w:rPr>
@@ -10259,7 +11231,6 @@
         <w:rPr>
           <w:color w:val="000000"/>
         </w:rPr>
-        <w:lastRenderedPageBreak/>
         <w:t>∙ The quadratus lumborum, lumbar paraspinals and erector spinae were taut and trigger points in these muscles were visualized and hypoechoic in nature.</w:t>
       </w:r>
     </w:p>
@@ -10618,13 +11589,23 @@
       </w:rPr>
       <w:t xml:space="preserve">Re: </w:t>
     </w:r>
+    <w:proofErr w:type="spellStart"/>
     <w:r>
       <w:rPr>
         <w:rFonts w:ascii="Times New Roman" w:hAnsi="Times New Roman" w:cs="Times New Roman"/>
         <w:sz w:val="24"/>
         <w:szCs w:val="24"/>
       </w:rPr>
-      <w:t>Fn Ln</w:t>
+      <w:t>Fn</w:t>
+    </w:r>
+    <w:proofErr w:type="spellEnd"/>
+    <w:r>
+      <w:rPr>
+        <w:rFonts w:ascii="Times New Roman" w:hAnsi="Times New Roman" w:cs="Times New Roman"/>
+        <w:sz w:val="24"/>
+        <w:szCs w:val="24"/>
+      </w:rPr>
+      <w:t xml:space="preserve"> Ln</w:t>
     </w:r>
   </w:p>
   <w:p>
@@ -12593,6 +13574,7 @@
   <w:style w:type="character" w:default="1" w:styleId="DefaultParagraphFont">
     <w:name w:val="Default Paragraph Font"/>
     <w:uiPriority w:val="1"/>
+    <w:semiHidden/>
     <w:unhideWhenUsed/>
   </w:style>
   <w:style w:type="table" w:default="1" w:styleId="TableNormal">

</xml_diff>